<commit_message>
feat: rebuild IES courseware with audited learning flow
</commit_message>
<xml_diff>
--- a/courseware/Lesson-Plan/IES-GenAI-for-Engineers-Lesson-Plan.docx
+++ b/courseware/Lesson-Plan/IES-GenAI-for-Engineers-Lesson-Plan.docx
@@ -7,7 +7,7 @@
         <w:pStyle w:val="Title"/>
       </w:pPr>
       <w:r>
-        <w:t>GenAI for Engineers Lesson Plan</w:t>
+        <w:t>GenAI for Engineers — Lesson Plan</w:t>
       </w:r>
     </w:p>
     <w:p>
@@ -15,53 +15,481 @@
         <w:pStyle w:val="Subtitle"/>
       </w:pPr>
       <w:r>
-        <w:t>IES | v3.4 | LP-aligned one-day delivery</w:t>
+        <w:t>IES | v4.0 | Aligned to supplied v2 PUB Feedback structure</w:t>
       </w:r>
     </w:p>
     <w:p>
+      <w:pPr>
+        <w:spacing w:after="100"/>
+      </w:pPr>
       <w:r>
-        <w:t>Follow the supplied Lesson Plan with Hands-On Labs (v2 - PUB Feedback) module order and clock times. Retain its six modules; consolidate learner work into only 65 minutes of guided Excel exercises within Module 3. Other practical examples are trainer-led demonstrations or discussion. LO4 includes a guided paired Copilot Agent build, two preview tests and approved training deployment evidence.</w:t>
+        <w:t>Course duration: one day, 09:00–17:00. 390 teaching minutes, 60-minute lunch and two 15-minute tea breaks. Delivery is instructor-led and activity-based. No prior FMEA, DMAIC or SPC background is assumed.</w:t>
       </w:r>
     </w:p>
     <w:p>
+      <w:pPr>
+        <w:pStyle w:val="Heading1"/>
+      </w:pPr>
       <w:r>
-        <w:t>09:00–17:00 = 480 minutes: 390 teaching minutes + 60 lunch + 30 tea. The source LP calls this seven training hours excluding lunch; that includes tea. This delivery plan uses 6.5 net teaching hours. Guided Excel time is 20 + 20 + 25 = 65 minutes, included within Module 3, never added on top.</w:t>
+        <w:t>Learning outcomes</w:t>
       </w:r>
     </w:p>
     <w:tbl>
       <w:tblPr>
-        <w:tblStyle w:val="TableGrid"/>
         <w:tblW w:type="auto" w:w="0"/>
-        <w:tblLayout w:type="fixed"/>
+        <w:jc w:val="center"/>
+        <w:tblLayout w:type="autofit"/>
         <w:tblLook w:firstColumn="1" w:firstRow="1" w:lastColumn="0" w:lastRow="0" w:noHBand="0" w:noVBand="1" w:val="04A0"/>
       </w:tblPr>
       <w:tblGrid>
-        <w:gridCol w:w="3250"/>
-        <w:gridCol w:w="3250"/>
-        <w:gridCol w:w="3250"/>
+        <w:gridCol w:w="5083"/>
+        <w:gridCol w:w="5083"/>
       </w:tblGrid>
       <w:tr>
-        <w:trPr>
-          <w:tblHeader/>
-        </w:trPr>
         <w:tc>
           <w:tcPr>
-            <w:tcW w:type="dxa" w:w="3250"/>
+            <w:tcW w:type="dxa" w:w="5083"/>
+            <w:shd w:fill="078897"/>
             <w:tcBorders>
-              <w:top w:val="single" w:sz="4" w:color="D9D9D9"/>
-              <w:left w:val="single" w:sz="4" w:color="D9D9D9"/>
-              <w:bottom w:val="single" w:sz="4" w:color="D9D9D9"/>
-              <w:right w:val="single" w:sz="4" w:color="D9D9D9"/>
+              <w:top w:val="single" w:sz="4" w:color="C8D9DC"/>
+              <w:left w:val="single" w:sz="4" w:color="C8D9DC"/>
+              <w:bottom w:val="single" w:sz="4" w:color="C8D9DC"/>
+              <w:right w:val="single" w:sz="4" w:color="C8D9DC"/>
+              <w:insideH w:val="single" w:sz="4" w:color="C8D9DC"/>
+              <w:insideV w:val="single" w:sz="4" w:color="C8D9DC"/>
             </w:tcBorders>
-            <w:shd w:fill="E4EBEF"/>
+            <w:vAlign w:val="center"/>
           </w:tcPr>
           <w:p>
-            <w:pPr>
-              <w:spacing w:after="100" w:before="100"/>
-            </w:pPr>
             <w:r>
               <w:rPr>
                 <w:b/>
+                <w:color w:val="FFFFFF"/>
+                <w:sz w:val="18"/>
+              </w:rPr>
+              <w:t>LO</w:t>
+            </w:r>
+          </w:p>
+        </w:tc>
+        <w:tc>
+          <w:tcPr>
+            <w:tcW w:type="dxa" w:w="5083"/>
+            <w:shd w:fill="078897"/>
+            <w:tcBorders>
+              <w:top w:val="single" w:sz="4" w:color="C8D9DC"/>
+              <w:left w:val="single" w:sz="4" w:color="C8D9DC"/>
+              <w:bottom w:val="single" w:sz="4" w:color="C8D9DC"/>
+              <w:right w:val="single" w:sz="4" w:color="C8D9DC"/>
+              <w:insideH w:val="single" w:sz="4" w:color="C8D9DC"/>
+              <w:insideV w:val="single" w:sz="4" w:color="C8D9DC"/>
+            </w:tcBorders>
+            <w:vAlign w:val="center"/>
+          </w:tcPr>
+          <w:p>
+            <w:r>
+              <w:rPr>
+                <w:b/>
+                <w:color w:val="FFFFFF"/>
+                <w:sz w:val="18"/>
+              </w:rPr>
+              <w:t>Outcome</w:t>
+            </w:r>
+          </w:p>
+        </w:tc>
+      </w:tr>
+      <w:tr>
+        <w:tc>
+          <w:tcPr>
+            <w:tcW w:type="dxa" w:w="5083"/>
+            <w:shd w:fill="FFFFFF"/>
+            <w:tcBorders>
+              <w:top w:val="single" w:sz="4" w:color="C8D9DC"/>
+              <w:left w:val="single" w:sz="4" w:color="C8D9DC"/>
+              <w:bottom w:val="single" w:sz="4" w:color="C8D9DC"/>
+              <w:right w:val="single" w:sz="4" w:color="C8D9DC"/>
+              <w:insideH w:val="single" w:sz="4" w:color="C8D9DC"/>
+              <w:insideV w:val="single" w:sz="4" w:color="C8D9DC"/>
+            </w:tcBorders>
+            <w:vAlign w:val="center"/>
+          </w:tcPr>
+          <w:p>
+            <w:r>
+              <w:rPr>
+                <w:color w:val="102B3E"/>
+                <w:sz w:val="17"/>
+              </w:rPr>
+              <w:t>LO1</w:t>
+            </w:r>
+          </w:p>
+        </w:tc>
+        <w:tc>
+          <w:tcPr>
+            <w:tcW w:type="dxa" w:w="5083"/>
+            <w:shd w:fill="FFFFFF"/>
+            <w:tcBorders>
+              <w:top w:val="single" w:sz="4" w:color="C8D9DC"/>
+              <w:left w:val="single" w:sz="4" w:color="C8D9DC"/>
+              <w:bottom w:val="single" w:sz="4" w:color="C8D9DC"/>
+              <w:right w:val="single" w:sz="4" w:color="C8D9DC"/>
+              <w:insideH w:val="single" w:sz="4" w:color="C8D9DC"/>
+              <w:insideV w:val="single" w:sz="4" w:color="C8D9DC"/>
+            </w:tcBorders>
+            <w:vAlign w:val="center"/>
+          </w:tcPr>
+          <w:p>
+            <w:r>
+              <w:rPr>
+                <w:color w:val="102B3E"/>
+                <w:sz w:val="17"/>
+              </w:rPr>
+              <w:t>Explain FMEA, Six Sigma/DMAIC and SPC before applying them.</w:t>
+            </w:r>
+          </w:p>
+        </w:tc>
+      </w:tr>
+      <w:tr>
+        <w:tc>
+          <w:tcPr>
+            <w:tcW w:type="dxa" w:w="5083"/>
+            <w:shd w:fill="EAF3F4"/>
+            <w:tcBorders>
+              <w:top w:val="single" w:sz="4" w:color="C8D9DC"/>
+              <w:left w:val="single" w:sz="4" w:color="C8D9DC"/>
+              <w:bottom w:val="single" w:sz="4" w:color="C8D9DC"/>
+              <w:right w:val="single" w:sz="4" w:color="C8D9DC"/>
+              <w:insideH w:val="single" w:sz="4" w:color="C8D9DC"/>
+              <w:insideV w:val="single" w:sz="4" w:color="C8D9DC"/>
+            </w:tcBorders>
+            <w:vAlign w:val="center"/>
+          </w:tcPr>
+          <w:p>
+            <w:r>
+              <w:rPr>
+                <w:color w:val="102B3E"/>
+                <w:sz w:val="17"/>
+              </w:rPr>
+              <w:t>LO2</w:t>
+            </w:r>
+          </w:p>
+        </w:tc>
+        <w:tc>
+          <w:tcPr>
+            <w:tcW w:type="dxa" w:w="5083"/>
+            <w:shd w:fill="EAF3F4"/>
+            <w:tcBorders>
+              <w:top w:val="single" w:sz="4" w:color="C8D9DC"/>
+              <w:left w:val="single" w:sz="4" w:color="C8D9DC"/>
+              <w:bottom w:val="single" w:sz="4" w:color="C8D9DC"/>
+              <w:right w:val="single" w:sz="4" w:color="C8D9DC"/>
+              <w:insideH w:val="single" w:sz="4" w:color="C8D9DC"/>
+              <w:insideV w:val="single" w:sz="4" w:color="C8D9DC"/>
+            </w:tcBorders>
+            <w:vAlign w:val="center"/>
+          </w:tcPr>
+          <w:p>
+            <w:r>
+              <w:rPr>
+                <w:color w:val="102B3E"/>
+                <w:sz w:val="17"/>
+              </w:rPr>
+              <w:t>Automate engineering documents and analyses with Copilot in Word, Excel and PowerPoint.</w:t>
+            </w:r>
+          </w:p>
+        </w:tc>
+      </w:tr>
+      <w:tr>
+        <w:tc>
+          <w:tcPr>
+            <w:tcW w:type="dxa" w:w="5083"/>
+            <w:shd w:fill="FFFFFF"/>
+            <w:tcBorders>
+              <w:top w:val="single" w:sz="4" w:color="C8D9DC"/>
+              <w:left w:val="single" w:sz="4" w:color="C8D9DC"/>
+              <w:bottom w:val="single" w:sz="4" w:color="C8D9DC"/>
+              <w:right w:val="single" w:sz="4" w:color="C8D9DC"/>
+              <w:insideH w:val="single" w:sz="4" w:color="C8D9DC"/>
+              <w:insideV w:val="single" w:sz="4" w:color="C8D9DC"/>
+            </w:tcBorders>
+            <w:vAlign w:val="center"/>
+          </w:tcPr>
+          <w:p>
+            <w:r>
+              <w:rPr>
+                <w:color w:val="102B3E"/>
+                <w:sz w:val="17"/>
+              </w:rPr>
+              <w:t>LO3</w:t>
+            </w:r>
+          </w:p>
+        </w:tc>
+        <w:tc>
+          <w:tcPr>
+            <w:tcW w:type="dxa" w:w="5083"/>
+            <w:shd w:fill="FFFFFF"/>
+            <w:tcBorders>
+              <w:top w:val="single" w:sz="4" w:color="C8D9DC"/>
+              <w:left w:val="single" w:sz="4" w:color="C8D9DC"/>
+              <w:bottom w:val="single" w:sz="4" w:color="C8D9DC"/>
+              <w:right w:val="single" w:sz="4" w:color="C8D9DC"/>
+              <w:insideH w:val="single" w:sz="4" w:color="C8D9DC"/>
+              <w:insideV w:val="single" w:sz="4" w:color="C8D9DC"/>
+            </w:tcBorders>
+            <w:vAlign w:val="center"/>
+          </w:tcPr>
+          <w:p>
+            <w:r>
+              <w:rPr>
+                <w:color w:val="102B3E"/>
+                <w:sz w:val="17"/>
+              </w:rPr>
+              <w:t>Apply R.I.S.E. and E-MAP with iterative prompting.</w:t>
+            </w:r>
+          </w:p>
+        </w:tc>
+      </w:tr>
+      <w:tr>
+        <w:tc>
+          <w:tcPr>
+            <w:tcW w:type="dxa" w:w="5083"/>
+            <w:shd w:fill="EAF3F4"/>
+            <w:tcBorders>
+              <w:top w:val="single" w:sz="4" w:color="C8D9DC"/>
+              <w:left w:val="single" w:sz="4" w:color="C8D9DC"/>
+              <w:bottom w:val="single" w:sz="4" w:color="C8D9DC"/>
+              <w:right w:val="single" w:sz="4" w:color="C8D9DC"/>
+              <w:insideH w:val="single" w:sz="4" w:color="C8D9DC"/>
+              <w:insideV w:val="single" w:sz="4" w:color="C8D9DC"/>
+            </w:tcBorders>
+            <w:vAlign w:val="center"/>
+          </w:tcPr>
+          <w:p>
+            <w:r>
+              <w:rPr>
+                <w:color w:val="102B3E"/>
+                <w:sz w:val="17"/>
+              </w:rPr>
+              <w:t>LO4</w:t>
+            </w:r>
+          </w:p>
+        </w:tc>
+        <w:tc>
+          <w:tcPr>
+            <w:tcW w:type="dxa" w:w="5083"/>
+            <w:shd w:fill="EAF3F4"/>
+            <w:tcBorders>
+              <w:top w:val="single" w:sz="4" w:color="C8D9DC"/>
+              <w:left w:val="single" w:sz="4" w:color="C8D9DC"/>
+              <w:bottom w:val="single" w:sz="4" w:color="C8D9DC"/>
+              <w:right w:val="single" w:sz="4" w:color="C8D9DC"/>
+              <w:insideH w:val="single" w:sz="4" w:color="C8D9DC"/>
+              <w:insideV w:val="single" w:sz="4" w:color="C8D9DC"/>
+            </w:tcBorders>
+            <w:vAlign w:val="center"/>
+          </w:tcPr>
+          <w:p>
+            <w:r>
+              <w:rPr>
+                <w:color w:val="102B3E"/>
+                <w:sz w:val="17"/>
+              </w:rPr>
+              <w:t>Build and deploy a multi-step Copilot Agent.</w:t>
+            </w:r>
+          </w:p>
+        </w:tc>
+      </w:tr>
+      <w:tr>
+        <w:tc>
+          <w:tcPr>
+            <w:tcW w:type="dxa" w:w="5083"/>
+            <w:shd w:fill="FFFFFF"/>
+            <w:tcBorders>
+              <w:top w:val="single" w:sz="4" w:color="C8D9DC"/>
+              <w:left w:val="single" w:sz="4" w:color="C8D9DC"/>
+              <w:bottom w:val="single" w:sz="4" w:color="C8D9DC"/>
+              <w:right w:val="single" w:sz="4" w:color="C8D9DC"/>
+              <w:insideH w:val="single" w:sz="4" w:color="C8D9DC"/>
+              <w:insideV w:val="single" w:sz="4" w:color="C8D9DC"/>
+            </w:tcBorders>
+            <w:vAlign w:val="center"/>
+          </w:tcPr>
+          <w:p>
+            <w:r>
+              <w:rPr>
+                <w:color w:val="102B3E"/>
+                <w:sz w:val="17"/>
+              </w:rPr>
+              <w:t>LO5</w:t>
+            </w:r>
+          </w:p>
+        </w:tc>
+        <w:tc>
+          <w:tcPr>
+            <w:tcW w:type="dxa" w:w="5083"/>
+            <w:shd w:fill="FFFFFF"/>
+            <w:tcBorders>
+              <w:top w:val="single" w:sz="4" w:color="C8D9DC"/>
+              <w:left w:val="single" w:sz="4" w:color="C8D9DC"/>
+              <w:bottom w:val="single" w:sz="4" w:color="C8D9DC"/>
+              <w:right w:val="single" w:sz="4" w:color="C8D9DC"/>
+              <w:insideH w:val="single" w:sz="4" w:color="C8D9DC"/>
+              <w:insideV w:val="single" w:sz="4" w:color="C8D9DC"/>
+            </w:tcBorders>
+            <w:vAlign w:val="center"/>
+          </w:tcPr>
+          <w:p>
+            <w:r>
+              <w:rPr>
+                <w:color w:val="102B3E"/>
+                <w:sz w:val="17"/>
+              </w:rPr>
+              <w:t>Use Researcher and Analyst for cited research and data analysis.</w:t>
+            </w:r>
+          </w:p>
+        </w:tc>
+      </w:tr>
+      <w:tr>
+        <w:tc>
+          <w:tcPr>
+            <w:tcW w:type="dxa" w:w="5083"/>
+            <w:shd w:fill="EAF3F4"/>
+            <w:tcBorders>
+              <w:top w:val="single" w:sz="4" w:color="C8D9DC"/>
+              <w:left w:val="single" w:sz="4" w:color="C8D9DC"/>
+              <w:bottom w:val="single" w:sz="4" w:color="C8D9DC"/>
+              <w:right w:val="single" w:sz="4" w:color="C8D9DC"/>
+              <w:insideH w:val="single" w:sz="4" w:color="C8D9DC"/>
+              <w:insideV w:val="single" w:sz="4" w:color="C8D9DC"/>
+            </w:tcBorders>
+            <w:vAlign w:val="center"/>
+          </w:tcPr>
+          <w:p>
+            <w:r>
+              <w:rPr>
+                <w:color w:val="102B3E"/>
+                <w:sz w:val="17"/>
+              </w:rPr>
+              <w:t>LO6</w:t>
+            </w:r>
+          </w:p>
+        </w:tc>
+        <w:tc>
+          <w:tcPr>
+            <w:tcW w:type="dxa" w:w="5083"/>
+            <w:shd w:fill="EAF3F4"/>
+            <w:tcBorders>
+              <w:top w:val="single" w:sz="4" w:color="C8D9DC"/>
+              <w:left w:val="single" w:sz="4" w:color="C8D9DC"/>
+              <w:bottom w:val="single" w:sz="4" w:color="C8D9DC"/>
+              <w:right w:val="single" w:sz="4" w:color="C8D9DC"/>
+              <w:insideH w:val="single" w:sz="4" w:color="C8D9DC"/>
+              <w:insideV w:val="single" w:sz="4" w:color="C8D9DC"/>
+            </w:tcBorders>
+            <w:vAlign w:val="center"/>
+          </w:tcPr>
+          <w:p>
+            <w:r>
+              <w:rPr>
+                <w:color w:val="102B3E"/>
+                <w:sz w:val="17"/>
+              </w:rPr>
+              <w:t>Ground an agent on SharePoint with cited, traceable answers.</w:t>
+            </w:r>
+          </w:p>
+        </w:tc>
+      </w:tr>
+      <w:tr>
+        <w:tc>
+          <w:tcPr>
+            <w:tcW w:type="dxa" w:w="5083"/>
+            <w:shd w:fill="FFFFFF"/>
+            <w:tcBorders>
+              <w:top w:val="single" w:sz="4" w:color="C8D9DC"/>
+              <w:left w:val="single" w:sz="4" w:color="C8D9DC"/>
+              <w:bottom w:val="single" w:sz="4" w:color="C8D9DC"/>
+              <w:right w:val="single" w:sz="4" w:color="C8D9DC"/>
+              <w:insideH w:val="single" w:sz="4" w:color="C8D9DC"/>
+              <w:insideV w:val="single" w:sz="4" w:color="C8D9DC"/>
+            </w:tcBorders>
+            <w:vAlign w:val="center"/>
+          </w:tcPr>
+          <w:p>
+            <w:r>
+              <w:rPr>
+                <w:color w:val="102B3E"/>
+                <w:sz w:val="17"/>
+              </w:rPr>
+              <w:t>LO7</w:t>
+            </w:r>
+          </w:p>
+        </w:tc>
+        <w:tc>
+          <w:tcPr>
+            <w:tcW w:type="dxa" w:w="5083"/>
+            <w:shd w:fill="FFFFFF"/>
+            <w:tcBorders>
+              <w:top w:val="single" w:sz="4" w:color="C8D9DC"/>
+              <w:left w:val="single" w:sz="4" w:color="C8D9DC"/>
+              <w:bottom w:val="single" w:sz="4" w:color="C8D9DC"/>
+              <w:right w:val="single" w:sz="4" w:color="C8D9DC"/>
+              <w:insideH w:val="single" w:sz="4" w:color="C8D9DC"/>
+              <w:insideV w:val="single" w:sz="4" w:color="C8D9DC"/>
+            </w:tcBorders>
+            <w:vAlign w:val="center"/>
+          </w:tcPr>
+          <w:p>
+            <w:r>
+              <w:rPr>
+                <w:color w:val="102B3E"/>
+                <w:sz w:val="17"/>
+              </w:rPr>
+              <w:t>Apply the complete 7-Step AI Security Framework.</w:t>
+            </w:r>
+          </w:p>
+        </w:tc>
+      </w:tr>
+    </w:tbl>
+    <w:p>
+      <w:pPr>
+        <w:pStyle w:val="Heading1"/>
+      </w:pPr>
+      <w:r>
+        <w:t>Detailed lesson plan</w:t>
+      </w:r>
+    </w:p>
+    <w:tbl>
+      <w:tblPr>
+        <w:tblW w:type="auto" w:w="0"/>
+        <w:jc w:val="center"/>
+        <w:tblLayout w:type="autofit"/>
+        <w:tblLook w:firstColumn="1" w:firstRow="1" w:lastColumn="0" w:lastRow="0" w:noHBand="0" w:noVBand="1" w:val="04A0"/>
+      </w:tblPr>
+      <w:tblGrid>
+        <w:gridCol w:w="2033"/>
+        <w:gridCol w:w="2033"/>
+        <w:gridCol w:w="2033"/>
+        <w:gridCol w:w="2033"/>
+        <w:gridCol w:w="2033"/>
+      </w:tblGrid>
+      <w:tr>
+        <w:tc>
+          <w:tcPr>
+            <w:tcW w:type="dxa" w:w="2033"/>
+            <w:shd w:fill="078897"/>
+            <w:tcBorders>
+              <w:top w:val="single" w:sz="4" w:color="C8D9DC"/>
+              <w:left w:val="single" w:sz="4" w:color="C8D9DC"/>
+              <w:bottom w:val="single" w:sz="4" w:color="C8D9DC"/>
+              <w:right w:val="single" w:sz="4" w:color="C8D9DC"/>
+              <w:insideH w:val="single" w:sz="4" w:color="C8D9DC"/>
+              <w:insideV w:val="single" w:sz="4" w:color="C8D9DC"/>
+            </w:tcBorders>
+            <w:vAlign w:val="center"/>
+          </w:tcPr>
+          <w:p>
+            <w:r>
+              <w:rPr>
+                <w:b/>
+                <w:color w:val="FFFFFF"/>
                 <w:sz w:val="18"/>
               </w:rPr>
               <w:t>Time</w:t>
@@ -70,49 +498,101 @@
         </w:tc>
         <w:tc>
           <w:tcPr>
-            <w:tcW w:type="dxa" w:w="3250"/>
+            <w:tcW w:type="dxa" w:w="2033"/>
+            <w:shd w:fill="078897"/>
             <w:tcBorders>
-              <w:top w:val="single" w:sz="4" w:color="D9D9D9"/>
-              <w:left w:val="single" w:sz="4" w:color="D9D9D9"/>
-              <w:bottom w:val="single" w:sz="4" w:color="D9D9D9"/>
-              <w:right w:val="single" w:sz="4" w:color="D9D9D9"/>
+              <w:top w:val="single" w:sz="4" w:color="C8D9DC"/>
+              <w:left w:val="single" w:sz="4" w:color="C8D9DC"/>
+              <w:bottom w:val="single" w:sz="4" w:color="C8D9DC"/>
+              <w:right w:val="single" w:sz="4" w:color="C8D9DC"/>
+              <w:insideH w:val="single" w:sz="4" w:color="C8D9DC"/>
+              <w:insideV w:val="single" w:sz="4" w:color="C8D9DC"/>
             </w:tcBorders>
-            <w:shd w:fill="E4EBEF"/>
+            <w:vAlign w:val="center"/>
           </w:tcPr>
           <w:p>
-            <w:pPr>
-              <w:spacing w:after="100" w:before="100"/>
-            </w:pPr>
             <w:r>
               <w:rPr>
                 <w:b/>
+                <w:color w:val="FFFFFF"/>
                 <w:sz w:val="18"/>
               </w:rPr>
-              <w:t>LP module</w:t>
+              <w:t>Module</w:t>
             </w:r>
           </w:p>
         </w:tc>
         <w:tc>
           <w:tcPr>
-            <w:tcW w:type="dxa" w:w="3250"/>
+            <w:tcW w:type="dxa" w:w="2033"/>
+            <w:shd w:fill="078897"/>
             <w:tcBorders>
-              <w:top w:val="single" w:sz="4" w:color="D9D9D9"/>
-              <w:left w:val="single" w:sz="4" w:color="D9D9D9"/>
-              <w:bottom w:val="single" w:sz="4" w:color="D9D9D9"/>
-              <w:right w:val="single" w:sz="4" w:color="D9D9D9"/>
+              <w:top w:val="single" w:sz="4" w:color="C8D9DC"/>
+              <w:left w:val="single" w:sz="4" w:color="C8D9DC"/>
+              <w:bottom w:val="single" w:sz="4" w:color="C8D9DC"/>
+              <w:right w:val="single" w:sz="4" w:color="C8D9DC"/>
+              <w:insideH w:val="single" w:sz="4" w:color="C8D9DC"/>
+              <w:insideV w:val="single" w:sz="4" w:color="C8D9DC"/>
             </w:tcBorders>
-            <w:shd w:fill="E4EBEF"/>
+            <w:vAlign w:val="center"/>
           </w:tcPr>
           <w:p>
-            <w:pPr>
-              <w:spacing w:after="100" w:before="100"/>
-            </w:pPr>
             <w:r>
               <w:rPr>
                 <w:b/>
+                <w:color w:val="FFFFFF"/>
                 <w:sz w:val="18"/>
               </w:rPr>
-              <w:t>Delivery allocation</w:t>
+              <w:t>PPT</w:t>
+            </w:r>
+          </w:p>
+        </w:tc>
+        <w:tc>
+          <w:tcPr>
+            <w:tcW w:type="dxa" w:w="2033"/>
+            <w:shd w:fill="078897"/>
+            <w:tcBorders>
+              <w:top w:val="single" w:sz="4" w:color="C8D9DC"/>
+              <w:left w:val="single" w:sz="4" w:color="C8D9DC"/>
+              <w:bottom w:val="single" w:sz="4" w:color="C8D9DC"/>
+              <w:right w:val="single" w:sz="4" w:color="C8D9DC"/>
+              <w:insideH w:val="single" w:sz="4" w:color="C8D9DC"/>
+              <w:insideV w:val="single" w:sz="4" w:color="C8D9DC"/>
+            </w:tcBorders>
+            <w:vAlign w:val="center"/>
+          </w:tcPr>
+          <w:p>
+            <w:r>
+              <w:rPr>
+                <w:b/>
+                <w:color w:val="FFFFFF"/>
+                <w:sz w:val="18"/>
+              </w:rPr>
+              <w:t>Content and activity</w:t>
+            </w:r>
+          </w:p>
+        </w:tc>
+        <w:tc>
+          <w:tcPr>
+            <w:tcW w:type="dxa" w:w="2033"/>
+            <w:shd w:fill="078897"/>
+            <w:tcBorders>
+              <w:top w:val="single" w:sz="4" w:color="C8D9DC"/>
+              <w:left w:val="single" w:sz="4" w:color="C8D9DC"/>
+              <w:bottom w:val="single" w:sz="4" w:color="C8D9DC"/>
+              <w:right w:val="single" w:sz="4" w:color="C8D9DC"/>
+              <w:insideH w:val="single" w:sz="4" w:color="C8D9DC"/>
+              <w:insideV w:val="single" w:sz="4" w:color="C8D9DC"/>
+            </w:tcBorders>
+            <w:vAlign w:val="center"/>
+          </w:tcPr>
+          <w:p>
+            <w:r>
+              <w:rPr>
+                <w:b/>
+                <w:color w:val="FFFFFF"/>
+                <w:sz w:val="18"/>
+              </w:rPr>
+              <w:t>LO</w:t>
             </w:r>
           </w:p>
         </w:tc>
@@ -120,22 +600,23 @@
       <w:tr>
         <w:tc>
           <w:tcPr>
-            <w:tcW w:type="dxa" w:w="3250"/>
+            <w:tcW w:type="dxa" w:w="2033"/>
+            <w:shd w:fill="FFFFFF"/>
             <w:tcBorders>
-              <w:top w:val="single" w:sz="4" w:color="D9D9D9"/>
-              <w:left w:val="single" w:sz="4" w:color="D9D9D9"/>
-              <w:bottom w:val="single" w:sz="4" w:color="D9D9D9"/>
-              <w:right w:val="single" w:sz="4" w:color="D9D9D9"/>
+              <w:top w:val="single" w:sz="4" w:color="C8D9DC"/>
+              <w:left w:val="single" w:sz="4" w:color="C8D9DC"/>
+              <w:bottom w:val="single" w:sz="4" w:color="C8D9DC"/>
+              <w:right w:val="single" w:sz="4" w:color="C8D9DC"/>
+              <w:insideH w:val="single" w:sz="4" w:color="C8D9DC"/>
+              <w:insideV w:val="single" w:sz="4" w:color="C8D9DC"/>
             </w:tcBorders>
+            <w:vAlign w:val="center"/>
           </w:tcPr>
           <w:p>
-            <w:pPr>
-              <w:spacing w:after="100" w:before="100"/>
-            </w:pPr>
             <w:r>
               <w:rPr>
-                <w:b w:val="0"/>
-                <w:sz w:val="18"/>
+                <w:color w:val="102B3E"/>
+                <w:sz w:val="17"/>
               </w:rPr>
               <w:t>09:00–10:00</w:t>
             </w:r>
@@ -143,22 +624,23 @@
         </w:tc>
         <w:tc>
           <w:tcPr>
-            <w:tcW w:type="dxa" w:w="3250"/>
+            <w:tcW w:type="dxa" w:w="2033"/>
+            <w:shd w:fill="FFFFFF"/>
             <w:tcBorders>
-              <w:top w:val="single" w:sz="4" w:color="D9D9D9"/>
-              <w:left w:val="single" w:sz="4" w:color="D9D9D9"/>
-              <w:bottom w:val="single" w:sz="4" w:color="D9D9D9"/>
-              <w:right w:val="single" w:sz="4" w:color="D9D9D9"/>
+              <w:top w:val="single" w:sz="4" w:color="C8D9DC"/>
+              <w:left w:val="single" w:sz="4" w:color="C8D9DC"/>
+              <w:bottom w:val="single" w:sz="4" w:color="C8D9DC"/>
+              <w:right w:val="single" w:sz="4" w:color="C8D9DC"/>
+              <w:insideH w:val="single" w:sz="4" w:color="C8D9DC"/>
+              <w:insideV w:val="single" w:sz="4" w:color="C8D9DC"/>
             </w:tcBorders>
+            <w:vAlign w:val="center"/>
           </w:tcPr>
           <w:p>
-            <w:pPr>
-              <w:spacing w:after="100" w:before="100"/>
-            </w:pPr>
             <w:r>
               <w:rPr>
-                <w:b w:val="0"/>
-                <w:sz w:val="18"/>
+                <w:color w:val="102B3E"/>
+                <w:sz w:val="17"/>
               </w:rPr>
               <w:t>1 · Copilot ecosystem</w:t>
             </w:r>
@@ -166,24 +648,73 @@
         </w:tc>
         <w:tc>
           <w:tcPr>
-            <w:tcW w:type="dxa" w:w="3250"/>
+            <w:tcW w:type="dxa" w:w="2033"/>
+            <w:shd w:fill="FFFFFF"/>
             <w:tcBorders>
-              <w:top w:val="single" w:sz="4" w:color="D9D9D9"/>
-              <w:left w:val="single" w:sz="4" w:color="D9D9D9"/>
-              <w:bottom w:val="single" w:sz="4" w:color="D9D9D9"/>
-              <w:right w:val="single" w:sz="4" w:color="D9D9D9"/>
+              <w:top w:val="single" w:sz="4" w:color="C8D9DC"/>
+              <w:left w:val="single" w:sz="4" w:color="C8D9DC"/>
+              <w:bottom w:val="single" w:sz="4" w:color="C8D9DC"/>
+              <w:right w:val="single" w:sz="4" w:color="C8D9DC"/>
+              <w:insideH w:val="single" w:sz="4" w:color="C8D9DC"/>
+              <w:insideV w:val="single" w:sz="4" w:color="C8D9DC"/>
             </w:tcBorders>
+            <w:vAlign w:val="center"/>
           </w:tcPr>
           <w:p>
-            <w:pPr>
-              <w:spacing w:after="100" w:before="100"/>
-            </w:pPr>
             <w:r>
               <w:rPr>
-                <w:b w:val="0"/>
-                <w:sz w:val="18"/>
+                <w:color w:val="102B3E"/>
+                <w:sz w:val="17"/>
               </w:rPr>
-              <w:t>15 overview; 10 access check; 20 Excel demonstration; 15 discussion</w:t>
+              <w:t>Slides 5–25</w:t>
+            </w:r>
+          </w:p>
+        </w:tc>
+        <w:tc>
+          <w:tcPr>
+            <w:tcW w:type="dxa" w:w="2033"/>
+            <w:shd w:fill="FFFFFF"/>
+            <w:tcBorders>
+              <w:top w:val="single" w:sz="4" w:color="C8D9DC"/>
+              <w:left w:val="single" w:sz="4" w:color="C8D9DC"/>
+              <w:bottom w:val="single" w:sz="4" w:color="C8D9DC"/>
+              <w:right w:val="single" w:sz="4" w:color="C8D9DC"/>
+              <w:insideH w:val="single" w:sz="4" w:color="C8D9DC"/>
+              <w:insideV w:val="single" w:sz="4" w:color="C8D9DC"/>
+            </w:tcBorders>
+            <w:vAlign w:val="center"/>
+          </w:tcPr>
+          <w:p>
+            <w:r>
+              <w:rPr>
+                <w:color w:val="102B3E"/>
+                <w:sz w:val="17"/>
+              </w:rPr>
+              <w:t>Ecosystem, productivity, CW-401 case; access check; AI-vs-engineer challenge</w:t>
+            </w:r>
+          </w:p>
+        </w:tc>
+        <w:tc>
+          <w:tcPr>
+            <w:tcW w:type="dxa" w:w="2033"/>
+            <w:shd w:fill="FFFFFF"/>
+            <w:tcBorders>
+              <w:top w:val="single" w:sz="4" w:color="C8D9DC"/>
+              <w:left w:val="single" w:sz="4" w:color="C8D9DC"/>
+              <w:bottom w:val="single" w:sz="4" w:color="C8D9DC"/>
+              <w:right w:val="single" w:sz="4" w:color="C8D9DC"/>
+              <w:insideH w:val="single" w:sz="4" w:color="C8D9DC"/>
+              <w:insideV w:val="single" w:sz="4" w:color="C8D9DC"/>
+            </w:tcBorders>
+            <w:vAlign w:val="center"/>
+          </w:tcPr>
+          <w:p>
+            <w:r>
+              <w:rPr>
+                <w:color w:val="102B3E"/>
+                <w:sz w:val="17"/>
+              </w:rPr>
+              <w:t>LO2, LO3</w:t>
             </w:r>
           </w:p>
         </w:tc>
@@ -191,22 +722,23 @@
       <w:tr>
         <w:tc>
           <w:tcPr>
-            <w:tcW w:type="dxa" w:w="3250"/>
+            <w:tcW w:type="dxa" w:w="2033"/>
+            <w:shd w:fill="EAF3F4"/>
             <w:tcBorders>
-              <w:top w:val="single" w:sz="4" w:color="D9D9D9"/>
-              <w:left w:val="single" w:sz="4" w:color="D9D9D9"/>
-              <w:bottom w:val="single" w:sz="4" w:color="D9D9D9"/>
-              <w:right w:val="single" w:sz="4" w:color="D9D9D9"/>
+              <w:top w:val="single" w:sz="4" w:color="C8D9DC"/>
+              <w:left w:val="single" w:sz="4" w:color="C8D9DC"/>
+              <w:bottom w:val="single" w:sz="4" w:color="C8D9DC"/>
+              <w:right w:val="single" w:sz="4" w:color="C8D9DC"/>
+              <w:insideH w:val="single" w:sz="4" w:color="C8D9DC"/>
+              <w:insideV w:val="single" w:sz="4" w:color="C8D9DC"/>
             </w:tcBorders>
+            <w:vAlign w:val="center"/>
           </w:tcPr>
           <w:p>
-            <w:pPr>
-              <w:spacing w:after="100" w:before="100"/>
-            </w:pPr>
             <w:r>
               <w:rPr>
-                <w:b w:val="0"/>
-                <w:sz w:val="18"/>
+                <w:color w:val="102B3E"/>
+                <w:sz w:val="17"/>
               </w:rPr>
               <w:t>10:00–11:15</w:t>
             </w:r>
@@ -214,47 +746,97 @@
         </w:tc>
         <w:tc>
           <w:tcPr>
-            <w:tcW w:type="dxa" w:w="3250"/>
+            <w:tcW w:type="dxa" w:w="2033"/>
+            <w:shd w:fill="EAF3F4"/>
             <w:tcBorders>
-              <w:top w:val="single" w:sz="4" w:color="D9D9D9"/>
-              <w:left w:val="single" w:sz="4" w:color="D9D9D9"/>
-              <w:bottom w:val="single" w:sz="4" w:color="D9D9D9"/>
-              <w:right w:val="single" w:sz="4" w:color="D9D9D9"/>
+              <w:top w:val="single" w:sz="4" w:color="C8D9DC"/>
+              <w:left w:val="single" w:sz="4" w:color="C8D9DC"/>
+              <w:bottom w:val="single" w:sz="4" w:color="C8D9DC"/>
+              <w:right w:val="single" w:sz="4" w:color="C8D9DC"/>
+              <w:insideH w:val="single" w:sz="4" w:color="C8D9DC"/>
+              <w:insideV w:val="single" w:sz="4" w:color="C8D9DC"/>
             </w:tcBorders>
+            <w:vAlign w:val="center"/>
           </w:tcPr>
           <w:p>
-            <w:pPr>
-              <w:spacing w:after="100" w:before="100"/>
-            </w:pPr>
             <w:r>
               <w:rPr>
-                <w:b w:val="0"/>
-                <w:sz w:val="18"/>
+                <w:color w:val="102B3E"/>
+                <w:sz w:val="17"/>
               </w:rPr>
-              <w:t>2 · Prompting for engineering documents</w:t>
+              <w:t>2 · Prompting</w:t>
             </w:r>
           </w:p>
         </w:tc>
         <w:tc>
           <w:tcPr>
-            <w:tcW w:type="dxa" w:w="3250"/>
+            <w:tcW w:type="dxa" w:w="2033"/>
+            <w:shd w:fill="EAF3F4"/>
             <w:tcBorders>
-              <w:top w:val="single" w:sz="4" w:color="D9D9D9"/>
-              <w:left w:val="single" w:sz="4" w:color="D9D9D9"/>
-              <w:bottom w:val="single" w:sz="4" w:color="D9D9D9"/>
-              <w:right w:val="single" w:sz="4" w:color="D9D9D9"/>
+              <w:top w:val="single" w:sz="4" w:color="C8D9DC"/>
+              <w:left w:val="single" w:sz="4" w:color="C8D9DC"/>
+              <w:bottom w:val="single" w:sz="4" w:color="C8D9DC"/>
+              <w:right w:val="single" w:sz="4" w:color="C8D9DC"/>
+              <w:insideH w:val="single" w:sz="4" w:color="C8D9DC"/>
+              <w:insideV w:val="single" w:sz="4" w:color="C8D9DC"/>
             </w:tcBorders>
+            <w:vAlign w:val="center"/>
           </w:tcPr>
           <w:p>
-            <w:pPr>
-              <w:spacing w:after="100" w:before="100"/>
-            </w:pPr>
             <w:r>
               <w:rPr>
-                <w:b w:val="0"/>
-                <w:sz w:val="18"/>
+                <w:color w:val="102B3E"/>
+                <w:sz w:val="17"/>
               </w:rPr>
-              <w:t>20 RISE/E-MAP; 20 document demonstration; 20 constraints and persona review; 15 prompt critique</w:t>
+              <w:t>Slides 26–55</w:t>
+            </w:r>
+          </w:p>
+        </w:tc>
+        <w:tc>
+          <w:tcPr>
+            <w:tcW w:type="dxa" w:w="2033"/>
+            <w:shd w:fill="EAF3F4"/>
+            <w:tcBorders>
+              <w:top w:val="single" w:sz="4" w:color="C8D9DC"/>
+              <w:left w:val="single" w:sz="4" w:color="C8D9DC"/>
+              <w:bottom w:val="single" w:sz="4" w:color="C8D9DC"/>
+              <w:right w:val="single" w:sz="4" w:color="C8D9DC"/>
+              <w:insideH w:val="single" w:sz="4" w:color="C8D9DC"/>
+              <w:insideV w:val="single" w:sz="4" w:color="C8D9DC"/>
+            </w:tcBorders>
+            <w:vAlign w:val="center"/>
+          </w:tcPr>
+          <w:p>
+            <w:r>
+              <w:rPr>
+                <w:color w:val="102B3E"/>
+                <w:sz w:val="17"/>
+              </w:rPr>
+              <w:t>RISE, E-MAP, constraints, iterative prompting, personas/debate; Word and PowerPoint document demos</w:t>
+            </w:r>
+          </w:p>
+        </w:tc>
+        <w:tc>
+          <w:tcPr>
+            <w:tcW w:type="dxa" w:w="2033"/>
+            <w:shd w:fill="EAF3F4"/>
+            <w:tcBorders>
+              <w:top w:val="single" w:sz="4" w:color="C8D9DC"/>
+              <w:left w:val="single" w:sz="4" w:color="C8D9DC"/>
+              <w:bottom w:val="single" w:sz="4" w:color="C8D9DC"/>
+              <w:right w:val="single" w:sz="4" w:color="C8D9DC"/>
+              <w:insideH w:val="single" w:sz="4" w:color="C8D9DC"/>
+              <w:insideV w:val="single" w:sz="4" w:color="C8D9DC"/>
+            </w:tcBorders>
+            <w:vAlign w:val="center"/>
+          </w:tcPr>
+          <w:p>
+            <w:r>
+              <w:rPr>
+                <w:color w:val="102B3E"/>
+                <w:sz w:val="17"/>
+              </w:rPr>
+              <w:t>LO2, LO3</w:t>
             </w:r>
           </w:p>
         </w:tc>
@@ -262,22 +844,23 @@
       <w:tr>
         <w:tc>
           <w:tcPr>
-            <w:tcW w:type="dxa" w:w="3250"/>
+            <w:tcW w:type="dxa" w:w="2033"/>
+            <w:shd w:fill="FFFFFF"/>
             <w:tcBorders>
-              <w:top w:val="single" w:sz="4" w:color="D9D9D9"/>
-              <w:left w:val="single" w:sz="4" w:color="D9D9D9"/>
-              <w:bottom w:val="single" w:sz="4" w:color="D9D9D9"/>
-              <w:right w:val="single" w:sz="4" w:color="D9D9D9"/>
+              <w:top w:val="single" w:sz="4" w:color="C8D9DC"/>
+              <w:left w:val="single" w:sz="4" w:color="C8D9DC"/>
+              <w:bottom w:val="single" w:sz="4" w:color="C8D9DC"/>
+              <w:right w:val="single" w:sz="4" w:color="C8D9DC"/>
+              <w:insideH w:val="single" w:sz="4" w:color="C8D9DC"/>
+              <w:insideV w:val="single" w:sz="4" w:color="C8D9DC"/>
             </w:tcBorders>
+            <w:vAlign w:val="center"/>
           </w:tcPr>
           <w:p>
-            <w:pPr>
-              <w:spacing w:after="100" w:before="100"/>
-            </w:pPr>
             <w:r>
               <w:rPr>
-                <w:b w:val="0"/>
-                <w:sz w:val="18"/>
+                <w:color w:val="102B3E"/>
+                <w:sz w:val="17"/>
               </w:rPr>
               <w:t>11:15–11:30</w:t>
             </w:r>
@@ -285,22 +868,23 @@
         </w:tc>
         <w:tc>
           <w:tcPr>
-            <w:tcW w:type="dxa" w:w="3250"/>
+            <w:tcW w:type="dxa" w:w="2033"/>
+            <w:shd w:fill="FFFFFF"/>
             <w:tcBorders>
-              <w:top w:val="single" w:sz="4" w:color="D9D9D9"/>
-              <w:left w:val="single" w:sz="4" w:color="D9D9D9"/>
-              <w:bottom w:val="single" w:sz="4" w:color="D9D9D9"/>
-              <w:right w:val="single" w:sz="4" w:color="D9D9D9"/>
+              <w:top w:val="single" w:sz="4" w:color="C8D9DC"/>
+              <w:left w:val="single" w:sz="4" w:color="C8D9DC"/>
+              <w:bottom w:val="single" w:sz="4" w:color="C8D9DC"/>
+              <w:right w:val="single" w:sz="4" w:color="C8D9DC"/>
+              <w:insideH w:val="single" w:sz="4" w:color="C8D9DC"/>
+              <w:insideV w:val="single" w:sz="4" w:color="C8D9DC"/>
             </w:tcBorders>
+            <w:vAlign w:val="center"/>
           </w:tcPr>
           <w:p>
-            <w:pPr>
-              <w:spacing w:after="100" w:before="100"/>
-            </w:pPr>
             <w:r>
               <w:rPr>
-                <w:b w:val="0"/>
-                <w:sz w:val="18"/>
+                <w:color w:val="102B3E"/>
+                <w:sz w:val="17"/>
               </w:rPr>
               <w:t>Tea break</w:t>
             </w:r>
@@ -308,24 +892,73 @@
         </w:tc>
         <w:tc>
           <w:tcPr>
-            <w:tcW w:type="dxa" w:w="3250"/>
+            <w:tcW w:type="dxa" w:w="2033"/>
+            <w:shd w:fill="FFFFFF"/>
             <w:tcBorders>
-              <w:top w:val="single" w:sz="4" w:color="D9D9D9"/>
-              <w:left w:val="single" w:sz="4" w:color="D9D9D9"/>
-              <w:bottom w:val="single" w:sz="4" w:color="D9D9D9"/>
-              <w:right w:val="single" w:sz="4" w:color="D9D9D9"/>
+              <w:top w:val="single" w:sz="4" w:color="C8D9DC"/>
+              <w:left w:val="single" w:sz="4" w:color="C8D9DC"/>
+              <w:bottom w:val="single" w:sz="4" w:color="C8D9DC"/>
+              <w:right w:val="single" w:sz="4" w:color="C8D9DC"/>
+              <w:insideH w:val="single" w:sz="4" w:color="C8D9DC"/>
+              <w:insideV w:val="single" w:sz="4" w:color="C8D9DC"/>
             </w:tcBorders>
+            <w:vAlign w:val="center"/>
           </w:tcPr>
           <w:p>
-            <w:pPr>
-              <w:spacing w:after="100" w:before="100"/>
-            </w:pPr>
             <w:r>
               <w:rPr>
-                <w:b w:val="0"/>
-                <w:sz w:val="18"/>
+                <w:color w:val="102B3E"/>
+                <w:sz w:val="17"/>
               </w:rPr>
-              <w:t>15 minutes</w:t>
+              <w:t>—</w:t>
+            </w:r>
+          </w:p>
+        </w:tc>
+        <w:tc>
+          <w:tcPr>
+            <w:tcW w:type="dxa" w:w="2033"/>
+            <w:shd w:fill="FFFFFF"/>
+            <w:tcBorders>
+              <w:top w:val="single" w:sz="4" w:color="C8D9DC"/>
+              <w:left w:val="single" w:sz="4" w:color="C8D9DC"/>
+              <w:bottom w:val="single" w:sz="4" w:color="C8D9DC"/>
+              <w:right w:val="single" w:sz="4" w:color="C8D9DC"/>
+              <w:insideH w:val="single" w:sz="4" w:color="C8D9DC"/>
+              <w:insideV w:val="single" w:sz="4" w:color="C8D9DC"/>
+            </w:tcBorders>
+            <w:vAlign w:val="center"/>
+          </w:tcPr>
+          <w:p>
+            <w:r>
+              <w:rPr>
+                <w:color w:val="102B3E"/>
+                <w:sz w:val="17"/>
+              </w:rPr>
+              <w:t>Break</w:t>
+            </w:r>
+          </w:p>
+        </w:tc>
+        <w:tc>
+          <w:tcPr>
+            <w:tcW w:type="dxa" w:w="2033"/>
+            <w:shd w:fill="FFFFFF"/>
+            <w:tcBorders>
+              <w:top w:val="single" w:sz="4" w:color="C8D9DC"/>
+              <w:left w:val="single" w:sz="4" w:color="C8D9DC"/>
+              <w:bottom w:val="single" w:sz="4" w:color="C8D9DC"/>
+              <w:right w:val="single" w:sz="4" w:color="C8D9DC"/>
+              <w:insideH w:val="single" w:sz="4" w:color="C8D9DC"/>
+              <w:insideV w:val="single" w:sz="4" w:color="C8D9DC"/>
+            </w:tcBorders>
+            <w:vAlign w:val="center"/>
+          </w:tcPr>
+          <w:p>
+            <w:r>
+              <w:rPr>
+                <w:color w:val="102B3E"/>
+                <w:sz w:val="17"/>
+              </w:rPr>
+              <w:t>—</w:t>
             </w:r>
           </w:p>
         </w:tc>
@@ -333,22 +966,23 @@
       <w:tr>
         <w:tc>
           <w:tcPr>
-            <w:tcW w:type="dxa" w:w="3250"/>
+            <w:tcW w:type="dxa" w:w="2033"/>
+            <w:shd w:fill="EAF3F4"/>
             <w:tcBorders>
-              <w:top w:val="single" w:sz="4" w:color="D9D9D9"/>
-              <w:left w:val="single" w:sz="4" w:color="D9D9D9"/>
-              <w:bottom w:val="single" w:sz="4" w:color="D9D9D9"/>
-              <w:right w:val="single" w:sz="4" w:color="D9D9D9"/>
+              <w:top w:val="single" w:sz="4" w:color="C8D9DC"/>
+              <w:left w:val="single" w:sz="4" w:color="C8D9DC"/>
+              <w:bottom w:val="single" w:sz="4" w:color="C8D9DC"/>
+              <w:right w:val="single" w:sz="4" w:color="C8D9DC"/>
+              <w:insideH w:val="single" w:sz="4" w:color="C8D9DC"/>
+              <w:insideV w:val="single" w:sz="4" w:color="C8D9DC"/>
             </w:tcBorders>
+            <w:vAlign w:val="center"/>
           </w:tcPr>
           <w:p>
-            <w:pPr>
-              <w:spacing w:after="100" w:before="100"/>
-            </w:pPr>
             <w:r>
               <w:rPr>
-                <w:b w:val="0"/>
-                <w:sz w:val="18"/>
+                <w:color w:val="102B3E"/>
+                <w:sz w:val="17"/>
               </w:rPr>
               <w:t>11:30–13:00</w:t>
             </w:r>
@@ -356,40 +990,97 @@
         </w:tc>
         <w:tc>
           <w:tcPr>
-            <w:tcW w:type="dxa" w:w="3250"/>
+            <w:tcW w:type="dxa" w:w="2033"/>
+            <w:shd w:fill="EAF3F4"/>
             <w:tcBorders>
-              <w:top w:val="single" w:sz="4" w:color="D9D9D9"/>
-              <w:left w:val="single" w:sz="4" w:color="D9D9D9"/>
-              <w:bottom w:val="single" w:sz="4" w:color="D9D9D9"/>
-              <w:right w:val="single" w:sz="4" w:color="D9D9D9"/>
+              <w:top w:val="single" w:sz="4" w:color="C8D9DC"/>
+              <w:left w:val="single" w:sz="4" w:color="C8D9DC"/>
+              <w:bottom w:val="single" w:sz="4" w:color="C8D9DC"/>
+              <w:right w:val="single" w:sz="4" w:color="C8D9DC"/>
+              <w:insideH w:val="single" w:sz="4" w:color="C8D9DC"/>
+              <w:insideV w:val="single" w:sz="4" w:color="C8D9DC"/>
             </w:tcBorders>
+            <w:vAlign w:val="center"/>
           </w:tcPr>
           <w:p>
-            <w:pPr>
-              <w:spacing w:after="100" w:before="100"/>
-            </w:pPr>
             <w:r>
               <w:rPr>
-                <w:b w:val="0"/>
-                <w:sz w:val="18"/>
+                <w:color w:val="102B3E"/>
+                <w:sz w:val="17"/>
               </w:rPr>
-              <w:t>3 · Engineering methodology and Excel</w:t>
+              <w:t>3 · FMEA → DMAIC → SPC</w:t>
             </w:r>
           </w:p>
         </w:tc>
         <w:tc>
           <w:tcPr>
-            <w:tcW w:type="dxa" w:w="3250"/>
+            <w:tcW w:type="dxa" w:w="2033"/>
+            <w:shd w:fill="EAF3F4"/>
             <w:tcBorders>
-              <w:top w:val="single" w:sz="4" w:color="D9D9D9"/>
-              <w:left w:val="single" w:sz="4" w:color="D9D9D9"/>
-              <w:bottom w:val="single" w:sz="4" w:color="D9D9D9"/>
-              <w:right w:val="single" w:sz="4" w:color="D9D9D9"/>
+              <w:top w:val="single" w:sz="4" w:color="C8D9DC"/>
+              <w:left w:val="single" w:sz="4" w:color="C8D9DC"/>
+              <w:bottom w:val="single" w:sz="4" w:color="C8D9DC"/>
+              <w:right w:val="single" w:sz="4" w:color="C8D9DC"/>
+              <w:insideH w:val="single" w:sz="4" w:color="C8D9DC"/>
+              <w:insideV w:val="single" w:sz="4" w:color="C8D9DC"/>
             </w:tcBorders>
+            <w:vAlign w:val="center"/>
           </w:tcPr>
           <w:p>
             <w:r>
-              <w:t>15 primer; 20 guided FMEA; 20 guided DMAIC; 25 guided SPC; 10 shared review</w:t>
+              <w:rPr>
+                <w:color w:val="102B3E"/>
+                <w:sz w:val="17"/>
+              </w:rPr>
+              <w:t>Slides 56–94</w:t>
+            </w:r>
+          </w:p>
+        </w:tc>
+        <w:tc>
+          <w:tcPr>
+            <w:tcW w:type="dxa" w:w="2033"/>
+            <w:shd w:fill="EAF3F4"/>
+            <w:tcBorders>
+              <w:top w:val="single" w:sz="4" w:color="C8D9DC"/>
+              <w:left w:val="single" w:sz="4" w:color="C8D9DC"/>
+              <w:bottom w:val="single" w:sz="4" w:color="C8D9DC"/>
+              <w:right w:val="single" w:sz="4" w:color="C8D9DC"/>
+              <w:insideH w:val="single" w:sz="4" w:color="C8D9DC"/>
+              <w:insideV w:val="single" w:sz="4" w:color="C8D9DC"/>
+            </w:tcBorders>
+            <w:vAlign w:val="center"/>
+          </w:tcPr>
+          <w:p>
+            <w:r>
+              <w:rPr>
+                <w:color w:val="102B3E"/>
+                <w:sz w:val="17"/>
+              </w:rPr>
+              <w:t>Primer 3.0; Lab 3.1 FMEA; Lab 3.2 DMAIC with SPC/Cp-Cpk; Lab 3.3 specification pack</w:t>
+            </w:r>
+          </w:p>
+        </w:tc>
+        <w:tc>
+          <w:tcPr>
+            <w:tcW w:type="dxa" w:w="2033"/>
+            <w:shd w:fill="EAF3F4"/>
+            <w:tcBorders>
+              <w:top w:val="single" w:sz="4" w:color="C8D9DC"/>
+              <w:left w:val="single" w:sz="4" w:color="C8D9DC"/>
+              <w:bottom w:val="single" w:sz="4" w:color="C8D9DC"/>
+              <w:right w:val="single" w:sz="4" w:color="C8D9DC"/>
+              <w:insideH w:val="single" w:sz="4" w:color="C8D9DC"/>
+              <w:insideV w:val="single" w:sz="4" w:color="C8D9DC"/>
+            </w:tcBorders>
+            <w:vAlign w:val="center"/>
+          </w:tcPr>
+          <w:p>
+            <w:r>
+              <w:rPr>
+                <w:color w:val="102B3E"/>
+                <w:sz w:val="17"/>
+              </w:rPr>
+              <w:t>LO1, LO2, LO3</w:t>
             </w:r>
           </w:p>
         </w:tc>
@@ -397,22 +1088,23 @@
       <w:tr>
         <w:tc>
           <w:tcPr>
-            <w:tcW w:type="dxa" w:w="3250"/>
+            <w:tcW w:type="dxa" w:w="2033"/>
+            <w:shd w:fill="FFFFFF"/>
             <w:tcBorders>
-              <w:top w:val="single" w:sz="4" w:color="D9D9D9"/>
-              <w:left w:val="single" w:sz="4" w:color="D9D9D9"/>
-              <w:bottom w:val="single" w:sz="4" w:color="D9D9D9"/>
-              <w:right w:val="single" w:sz="4" w:color="D9D9D9"/>
+              <w:top w:val="single" w:sz="4" w:color="C8D9DC"/>
+              <w:left w:val="single" w:sz="4" w:color="C8D9DC"/>
+              <w:bottom w:val="single" w:sz="4" w:color="C8D9DC"/>
+              <w:right w:val="single" w:sz="4" w:color="C8D9DC"/>
+              <w:insideH w:val="single" w:sz="4" w:color="C8D9DC"/>
+              <w:insideV w:val="single" w:sz="4" w:color="C8D9DC"/>
             </w:tcBorders>
+            <w:vAlign w:val="center"/>
           </w:tcPr>
           <w:p>
-            <w:pPr>
-              <w:spacing w:after="100" w:before="100"/>
-            </w:pPr>
             <w:r>
               <w:rPr>
-                <w:b w:val="0"/>
-                <w:sz w:val="18"/>
+                <w:color w:val="102B3E"/>
+                <w:sz w:val="17"/>
               </w:rPr>
               <w:t>13:00–14:00</w:t>
             </w:r>
@@ -420,22 +1112,23 @@
         </w:tc>
         <w:tc>
           <w:tcPr>
-            <w:tcW w:type="dxa" w:w="3250"/>
+            <w:tcW w:type="dxa" w:w="2033"/>
+            <w:shd w:fill="FFFFFF"/>
             <w:tcBorders>
-              <w:top w:val="single" w:sz="4" w:color="D9D9D9"/>
-              <w:left w:val="single" w:sz="4" w:color="D9D9D9"/>
-              <w:bottom w:val="single" w:sz="4" w:color="D9D9D9"/>
-              <w:right w:val="single" w:sz="4" w:color="D9D9D9"/>
+              <w:top w:val="single" w:sz="4" w:color="C8D9DC"/>
+              <w:left w:val="single" w:sz="4" w:color="C8D9DC"/>
+              <w:bottom w:val="single" w:sz="4" w:color="C8D9DC"/>
+              <w:right w:val="single" w:sz="4" w:color="C8D9DC"/>
+              <w:insideH w:val="single" w:sz="4" w:color="C8D9DC"/>
+              <w:insideV w:val="single" w:sz="4" w:color="C8D9DC"/>
             </w:tcBorders>
+            <w:vAlign w:val="center"/>
           </w:tcPr>
           <w:p>
-            <w:pPr>
-              <w:spacing w:after="100" w:before="100"/>
-            </w:pPr>
             <w:r>
               <w:rPr>
-                <w:b w:val="0"/>
-                <w:sz w:val="18"/>
+                <w:color w:val="102B3E"/>
+                <w:sz w:val="17"/>
               </w:rPr>
               <w:t>Lunch</w:t>
             </w:r>
@@ -443,24 +1136,73 @@
         </w:tc>
         <w:tc>
           <w:tcPr>
-            <w:tcW w:type="dxa" w:w="3250"/>
+            <w:tcW w:type="dxa" w:w="2033"/>
+            <w:shd w:fill="FFFFFF"/>
             <w:tcBorders>
-              <w:top w:val="single" w:sz="4" w:color="D9D9D9"/>
-              <w:left w:val="single" w:sz="4" w:color="D9D9D9"/>
-              <w:bottom w:val="single" w:sz="4" w:color="D9D9D9"/>
-              <w:right w:val="single" w:sz="4" w:color="D9D9D9"/>
+              <w:top w:val="single" w:sz="4" w:color="C8D9DC"/>
+              <w:left w:val="single" w:sz="4" w:color="C8D9DC"/>
+              <w:bottom w:val="single" w:sz="4" w:color="C8D9DC"/>
+              <w:right w:val="single" w:sz="4" w:color="C8D9DC"/>
+              <w:insideH w:val="single" w:sz="4" w:color="C8D9DC"/>
+              <w:insideV w:val="single" w:sz="4" w:color="C8D9DC"/>
             </w:tcBorders>
+            <w:vAlign w:val="center"/>
           </w:tcPr>
           <w:p>
-            <w:pPr>
-              <w:spacing w:after="100" w:before="100"/>
-            </w:pPr>
             <w:r>
               <w:rPr>
-                <w:b w:val="0"/>
-                <w:sz w:val="18"/>
+                <w:color w:val="102B3E"/>
+                <w:sz w:val="17"/>
               </w:rPr>
-              <w:t>60 minutes</w:t>
+              <w:t>—</w:t>
+            </w:r>
+          </w:p>
+        </w:tc>
+        <w:tc>
+          <w:tcPr>
+            <w:tcW w:type="dxa" w:w="2033"/>
+            <w:shd w:fill="FFFFFF"/>
+            <w:tcBorders>
+              <w:top w:val="single" w:sz="4" w:color="C8D9DC"/>
+              <w:left w:val="single" w:sz="4" w:color="C8D9DC"/>
+              <w:bottom w:val="single" w:sz="4" w:color="C8D9DC"/>
+              <w:right w:val="single" w:sz="4" w:color="C8D9DC"/>
+              <w:insideH w:val="single" w:sz="4" w:color="C8D9DC"/>
+              <w:insideV w:val="single" w:sz="4" w:color="C8D9DC"/>
+            </w:tcBorders>
+            <w:vAlign w:val="center"/>
+          </w:tcPr>
+          <w:p>
+            <w:r>
+              <w:rPr>
+                <w:color w:val="102B3E"/>
+                <w:sz w:val="17"/>
+              </w:rPr>
+              <w:t>Break</w:t>
+            </w:r>
+          </w:p>
+        </w:tc>
+        <w:tc>
+          <w:tcPr>
+            <w:tcW w:type="dxa" w:w="2033"/>
+            <w:shd w:fill="FFFFFF"/>
+            <w:tcBorders>
+              <w:top w:val="single" w:sz="4" w:color="C8D9DC"/>
+              <w:left w:val="single" w:sz="4" w:color="C8D9DC"/>
+              <w:bottom w:val="single" w:sz="4" w:color="C8D9DC"/>
+              <w:right w:val="single" w:sz="4" w:color="C8D9DC"/>
+              <w:insideH w:val="single" w:sz="4" w:color="C8D9DC"/>
+              <w:insideV w:val="single" w:sz="4" w:color="C8D9DC"/>
+            </w:tcBorders>
+            <w:vAlign w:val="center"/>
+          </w:tcPr>
+          <w:p>
+            <w:r>
+              <w:rPr>
+                <w:color w:val="102B3E"/>
+                <w:sz w:val="17"/>
+              </w:rPr>
+              <w:t>—</w:t>
             </w:r>
           </w:p>
         </w:tc>
@@ -468,22 +1210,23 @@
       <w:tr>
         <w:tc>
           <w:tcPr>
-            <w:tcW w:type="dxa" w:w="3250"/>
+            <w:tcW w:type="dxa" w:w="2033"/>
+            <w:shd w:fill="EAF3F4"/>
             <w:tcBorders>
-              <w:top w:val="single" w:sz="4" w:color="D9D9D9"/>
-              <w:left w:val="single" w:sz="4" w:color="D9D9D9"/>
-              <w:bottom w:val="single" w:sz="4" w:color="D9D9D9"/>
-              <w:right w:val="single" w:sz="4" w:color="D9D9D9"/>
+              <w:top w:val="single" w:sz="4" w:color="C8D9DC"/>
+              <w:left w:val="single" w:sz="4" w:color="C8D9DC"/>
+              <w:bottom w:val="single" w:sz="4" w:color="C8D9DC"/>
+              <w:right w:val="single" w:sz="4" w:color="C8D9DC"/>
+              <w:insideH w:val="single" w:sz="4" w:color="C8D9DC"/>
+              <w:insideV w:val="single" w:sz="4" w:color="C8D9DC"/>
             </w:tcBorders>
+            <w:vAlign w:val="center"/>
           </w:tcPr>
           <w:p>
-            <w:pPr>
-              <w:spacing w:after="100" w:before="100"/>
-            </w:pPr>
             <w:r>
               <w:rPr>
-                <w:b w:val="0"/>
-                <w:sz w:val="18"/>
+                <w:color w:val="102B3E"/>
+                <w:sz w:val="17"/>
               </w:rPr>
               <w:t>14:00–15:15</w:t>
             </w:r>
@@ -491,47 +1234,97 @@
         </w:tc>
         <w:tc>
           <w:tcPr>
-            <w:tcW w:type="dxa" w:w="3250"/>
+            <w:tcW w:type="dxa" w:w="2033"/>
+            <w:shd w:fill="EAF3F4"/>
             <w:tcBorders>
-              <w:top w:val="single" w:sz="4" w:color="D9D9D9"/>
-              <w:left w:val="single" w:sz="4" w:color="D9D9D9"/>
-              <w:bottom w:val="single" w:sz="4" w:color="D9D9D9"/>
-              <w:right w:val="single" w:sz="4" w:color="D9D9D9"/>
+              <w:top w:val="single" w:sz="4" w:color="C8D9DC"/>
+              <w:left w:val="single" w:sz="4" w:color="C8D9DC"/>
+              <w:bottom w:val="single" w:sz="4" w:color="C8D9DC"/>
+              <w:right w:val="single" w:sz="4" w:color="C8D9DC"/>
+              <w:insideH w:val="single" w:sz="4" w:color="C8D9DC"/>
+              <w:insideV w:val="single" w:sz="4" w:color="C8D9DC"/>
             </w:tcBorders>
+            <w:vAlign w:val="center"/>
           </w:tcPr>
           <w:p>
-            <w:pPr>
-              <w:spacing w:after="100" w:before="100"/>
-            </w:pPr>
             <w:r>
               <w:rPr>
-                <w:b w:val="0"/>
-                <w:sz w:val="18"/>
+                <w:color w:val="102B3E"/>
+                <w:sz w:val="17"/>
               </w:rPr>
-              <w:t>4 · Copilot and reasoning agents</w:t>
+              <w:t>4 · Agents</w:t>
             </w:r>
           </w:p>
         </w:tc>
         <w:tc>
           <w:tcPr>
-            <w:tcW w:type="dxa" w:w="3250"/>
+            <w:tcW w:type="dxa" w:w="2033"/>
+            <w:shd w:fill="EAF3F4"/>
             <w:tcBorders>
-              <w:top w:val="single" w:sz="4" w:color="D9D9D9"/>
-              <w:left w:val="single" w:sz="4" w:color="D9D9D9"/>
-              <w:bottom w:val="single" w:sz="4" w:color="D9D9D9"/>
-              <w:right w:val="single" w:sz="4" w:color="D9D9D9"/>
+              <w:top w:val="single" w:sz="4" w:color="C8D9DC"/>
+              <w:left w:val="single" w:sz="4" w:color="C8D9DC"/>
+              <w:bottom w:val="single" w:sz="4" w:color="C8D9DC"/>
+              <w:right w:val="single" w:sz="4" w:color="C8D9DC"/>
+              <w:insideH w:val="single" w:sz="4" w:color="C8D9DC"/>
+              <w:insideV w:val="single" w:sz="4" w:color="C8D9DC"/>
             </w:tcBorders>
+            <w:vAlign w:val="center"/>
           </w:tcPr>
           <w:p>
-            <w:pPr>
-              <w:spacing w:after="100" w:before="100"/>
-            </w:pPr>
             <w:r>
               <w:rPr>
-                <w:b w:val="0"/>
-                <w:sz w:val="18"/>
+                <w:color w:val="102B3E"/>
+                <w:sz w:val="17"/>
               </w:rPr>
-              <w:t>15 concepts; 25 FMEA/report assistant demo; 20 research/analysis comparison; 15 questions and buffer</w:t>
+              <w:t>Slides 95–124</w:t>
+            </w:r>
+          </w:p>
+        </w:tc>
+        <w:tc>
+          <w:tcPr>
+            <w:tcW w:type="dxa" w:w="2033"/>
+            <w:shd w:fill="EAF3F4"/>
+            <w:tcBorders>
+              <w:top w:val="single" w:sz="4" w:color="C8D9DC"/>
+              <w:left w:val="single" w:sz="4" w:color="C8D9DC"/>
+              <w:bottom w:val="single" w:sz="4" w:color="C8D9DC"/>
+              <w:right w:val="single" w:sz="4" w:color="C8D9DC"/>
+              <w:insideH w:val="single" w:sz="4" w:color="C8D9DC"/>
+              <w:insideV w:val="single" w:sz="4" w:color="C8D9DC"/>
+            </w:tcBorders>
+            <w:vAlign w:val="center"/>
+          </w:tcPr>
+          <w:p>
+            <w:r>
+              <w:rPr>
+                <w:color w:val="102B3E"/>
+                <w:sz w:val="17"/>
+              </w:rPr>
+              <w:t>FMEA Agent multi-step build/test; Report Writer/recurring workflow; Researcher and Analyst</w:t>
+            </w:r>
+          </w:p>
+        </w:tc>
+        <w:tc>
+          <w:tcPr>
+            <w:tcW w:type="dxa" w:w="2033"/>
+            <w:shd w:fill="EAF3F4"/>
+            <w:tcBorders>
+              <w:top w:val="single" w:sz="4" w:color="C8D9DC"/>
+              <w:left w:val="single" w:sz="4" w:color="C8D9DC"/>
+              <w:bottom w:val="single" w:sz="4" w:color="C8D9DC"/>
+              <w:right w:val="single" w:sz="4" w:color="C8D9DC"/>
+              <w:insideH w:val="single" w:sz="4" w:color="C8D9DC"/>
+              <w:insideV w:val="single" w:sz="4" w:color="C8D9DC"/>
+            </w:tcBorders>
+            <w:vAlign w:val="center"/>
+          </w:tcPr>
+          <w:p>
+            <w:r>
+              <w:rPr>
+                <w:color w:val="102B3E"/>
+                <w:sz w:val="17"/>
+              </w:rPr>
+              <w:t>LO4, LO5</w:t>
             </w:r>
           </w:p>
         </w:tc>
@@ -539,22 +1332,23 @@
       <w:tr>
         <w:tc>
           <w:tcPr>
-            <w:tcW w:type="dxa" w:w="3250"/>
+            <w:tcW w:type="dxa" w:w="2033"/>
+            <w:shd w:fill="FFFFFF"/>
             <w:tcBorders>
-              <w:top w:val="single" w:sz="4" w:color="D9D9D9"/>
-              <w:left w:val="single" w:sz="4" w:color="D9D9D9"/>
-              <w:bottom w:val="single" w:sz="4" w:color="D9D9D9"/>
-              <w:right w:val="single" w:sz="4" w:color="D9D9D9"/>
+              <w:top w:val="single" w:sz="4" w:color="C8D9DC"/>
+              <w:left w:val="single" w:sz="4" w:color="C8D9DC"/>
+              <w:bottom w:val="single" w:sz="4" w:color="C8D9DC"/>
+              <w:right w:val="single" w:sz="4" w:color="C8D9DC"/>
+              <w:insideH w:val="single" w:sz="4" w:color="C8D9DC"/>
+              <w:insideV w:val="single" w:sz="4" w:color="C8D9DC"/>
             </w:tcBorders>
+            <w:vAlign w:val="center"/>
           </w:tcPr>
           <w:p>
-            <w:pPr>
-              <w:spacing w:after="100" w:before="100"/>
-            </w:pPr>
             <w:r>
               <w:rPr>
-                <w:b w:val="0"/>
-                <w:sz w:val="18"/>
+                <w:color w:val="102B3E"/>
+                <w:sz w:val="17"/>
               </w:rPr>
               <w:t>15:15–15:30</w:t>
             </w:r>
@@ -562,22 +1356,23 @@
         </w:tc>
         <w:tc>
           <w:tcPr>
-            <w:tcW w:type="dxa" w:w="3250"/>
+            <w:tcW w:type="dxa" w:w="2033"/>
+            <w:shd w:fill="FFFFFF"/>
             <w:tcBorders>
-              <w:top w:val="single" w:sz="4" w:color="D9D9D9"/>
-              <w:left w:val="single" w:sz="4" w:color="D9D9D9"/>
-              <w:bottom w:val="single" w:sz="4" w:color="D9D9D9"/>
-              <w:right w:val="single" w:sz="4" w:color="D9D9D9"/>
+              <w:top w:val="single" w:sz="4" w:color="C8D9DC"/>
+              <w:left w:val="single" w:sz="4" w:color="C8D9DC"/>
+              <w:bottom w:val="single" w:sz="4" w:color="C8D9DC"/>
+              <w:right w:val="single" w:sz="4" w:color="C8D9DC"/>
+              <w:insideH w:val="single" w:sz="4" w:color="C8D9DC"/>
+              <w:insideV w:val="single" w:sz="4" w:color="C8D9DC"/>
             </w:tcBorders>
+            <w:vAlign w:val="center"/>
           </w:tcPr>
           <w:p>
-            <w:pPr>
-              <w:spacing w:after="100" w:before="100"/>
-            </w:pPr>
             <w:r>
               <w:rPr>
-                <w:b w:val="0"/>
-                <w:sz w:val="18"/>
+                <w:color w:val="102B3E"/>
+                <w:sz w:val="17"/>
               </w:rPr>
               <w:t>Tea break</w:t>
             </w:r>
@@ -585,24 +1380,73 @@
         </w:tc>
         <w:tc>
           <w:tcPr>
-            <w:tcW w:type="dxa" w:w="3250"/>
+            <w:tcW w:type="dxa" w:w="2033"/>
+            <w:shd w:fill="FFFFFF"/>
             <w:tcBorders>
-              <w:top w:val="single" w:sz="4" w:color="D9D9D9"/>
-              <w:left w:val="single" w:sz="4" w:color="D9D9D9"/>
-              <w:bottom w:val="single" w:sz="4" w:color="D9D9D9"/>
-              <w:right w:val="single" w:sz="4" w:color="D9D9D9"/>
+              <w:top w:val="single" w:sz="4" w:color="C8D9DC"/>
+              <w:left w:val="single" w:sz="4" w:color="C8D9DC"/>
+              <w:bottom w:val="single" w:sz="4" w:color="C8D9DC"/>
+              <w:right w:val="single" w:sz="4" w:color="C8D9DC"/>
+              <w:insideH w:val="single" w:sz="4" w:color="C8D9DC"/>
+              <w:insideV w:val="single" w:sz="4" w:color="C8D9DC"/>
             </w:tcBorders>
+            <w:vAlign w:val="center"/>
           </w:tcPr>
           <w:p>
-            <w:pPr>
-              <w:spacing w:after="100" w:before="100"/>
-            </w:pPr>
             <w:r>
               <w:rPr>
-                <w:b w:val="0"/>
-                <w:sz w:val="18"/>
+                <w:color w:val="102B3E"/>
+                <w:sz w:val="17"/>
               </w:rPr>
-              <w:t>15 minutes</w:t>
+              <w:t>—</w:t>
+            </w:r>
+          </w:p>
+        </w:tc>
+        <w:tc>
+          <w:tcPr>
+            <w:tcW w:type="dxa" w:w="2033"/>
+            <w:shd w:fill="FFFFFF"/>
+            <w:tcBorders>
+              <w:top w:val="single" w:sz="4" w:color="C8D9DC"/>
+              <w:left w:val="single" w:sz="4" w:color="C8D9DC"/>
+              <w:bottom w:val="single" w:sz="4" w:color="C8D9DC"/>
+              <w:right w:val="single" w:sz="4" w:color="C8D9DC"/>
+              <w:insideH w:val="single" w:sz="4" w:color="C8D9DC"/>
+              <w:insideV w:val="single" w:sz="4" w:color="C8D9DC"/>
+            </w:tcBorders>
+            <w:vAlign w:val="center"/>
+          </w:tcPr>
+          <w:p>
+            <w:r>
+              <w:rPr>
+                <w:color w:val="102B3E"/>
+                <w:sz w:val="17"/>
+              </w:rPr>
+              <w:t>Break</w:t>
+            </w:r>
+          </w:p>
+        </w:tc>
+        <w:tc>
+          <w:tcPr>
+            <w:tcW w:type="dxa" w:w="2033"/>
+            <w:shd w:fill="FFFFFF"/>
+            <w:tcBorders>
+              <w:top w:val="single" w:sz="4" w:color="C8D9DC"/>
+              <w:left w:val="single" w:sz="4" w:color="C8D9DC"/>
+              <w:bottom w:val="single" w:sz="4" w:color="C8D9DC"/>
+              <w:right w:val="single" w:sz="4" w:color="C8D9DC"/>
+              <w:insideH w:val="single" w:sz="4" w:color="C8D9DC"/>
+              <w:insideV w:val="single" w:sz="4" w:color="C8D9DC"/>
+            </w:tcBorders>
+            <w:vAlign w:val="center"/>
+          </w:tcPr>
+          <w:p>
+            <w:r>
+              <w:rPr>
+                <w:color w:val="102B3E"/>
+                <w:sz w:val="17"/>
+              </w:rPr>
+              <w:t>—</w:t>
             </w:r>
           </w:p>
         </w:tc>
@@ -610,22 +1454,23 @@
       <w:tr>
         <w:tc>
           <w:tcPr>
-            <w:tcW w:type="dxa" w:w="3250"/>
+            <w:tcW w:type="dxa" w:w="2033"/>
+            <w:shd w:fill="EAF3F4"/>
             <w:tcBorders>
-              <w:top w:val="single" w:sz="4" w:color="D9D9D9"/>
-              <w:left w:val="single" w:sz="4" w:color="D9D9D9"/>
-              <w:bottom w:val="single" w:sz="4" w:color="D9D9D9"/>
-              <w:right w:val="single" w:sz="4" w:color="D9D9D9"/>
+              <w:top w:val="single" w:sz="4" w:color="C8D9DC"/>
+              <w:left w:val="single" w:sz="4" w:color="C8D9DC"/>
+              <w:bottom w:val="single" w:sz="4" w:color="C8D9DC"/>
+              <w:right w:val="single" w:sz="4" w:color="C8D9DC"/>
+              <w:insideH w:val="single" w:sz="4" w:color="C8D9DC"/>
+              <w:insideV w:val="single" w:sz="4" w:color="C8D9DC"/>
             </w:tcBorders>
+            <w:vAlign w:val="center"/>
           </w:tcPr>
           <w:p>
-            <w:pPr>
-              <w:spacing w:after="100" w:before="100"/>
-            </w:pPr>
             <w:r>
               <w:rPr>
-                <w:b w:val="0"/>
-                <w:sz w:val="18"/>
+                <w:color w:val="102B3E"/>
+                <w:sz w:val="17"/>
               </w:rPr>
               <w:t>15:30–16:15</w:t>
             </w:r>
@@ -633,33 +1478,97 @@
         </w:tc>
         <w:tc>
           <w:tcPr>
-            <w:tcW w:type="dxa" w:w="3250"/>
+            <w:tcW w:type="dxa" w:w="2033"/>
+            <w:shd w:fill="EAF3F4"/>
             <w:tcBorders>
-              <w:top w:val="single" w:sz="4" w:color="D9D9D9"/>
-              <w:left w:val="single" w:sz="4" w:color="D9D9D9"/>
-              <w:bottom w:val="single" w:sz="4" w:color="D9D9D9"/>
-              <w:right w:val="single" w:sz="4" w:color="D9D9D9"/>
+              <w:top w:val="single" w:sz="4" w:color="C8D9DC"/>
+              <w:left w:val="single" w:sz="4" w:color="C8D9DC"/>
+              <w:bottom w:val="single" w:sz="4" w:color="C8D9DC"/>
+              <w:right w:val="single" w:sz="4" w:color="C8D9DC"/>
+              <w:insideH w:val="single" w:sz="4" w:color="C8D9DC"/>
+              <w:insideV w:val="single" w:sz="4" w:color="C8D9DC"/>
             </w:tcBorders>
+            <w:vAlign w:val="center"/>
           </w:tcPr>
           <w:p>
             <w:r>
-              <w:t>5 · SharePoint knowledge base and grounded agent</w:t>
+              <w:rPr>
+                <w:color w:val="102B3E"/>
+                <w:sz w:val="17"/>
+              </w:rPr>
+              <w:t>5 · SharePoint</w:t>
             </w:r>
           </w:p>
         </w:tc>
         <w:tc>
           <w:tcPr>
-            <w:tcW w:type="dxa" w:w="3250"/>
+            <w:tcW w:type="dxa" w:w="2033"/>
+            <w:shd w:fill="EAF3F4"/>
             <w:tcBorders>
-              <w:top w:val="single" w:sz="4" w:color="D9D9D9"/>
-              <w:left w:val="single" w:sz="4" w:color="D9D9D9"/>
-              <w:bottom w:val="single" w:sz="4" w:color="D9D9D9"/>
-              <w:right w:val="single" w:sz="4" w:color="D9D9D9"/>
+              <w:top w:val="single" w:sz="4" w:color="C8D9DC"/>
+              <w:left w:val="single" w:sz="4" w:color="C8D9DC"/>
+              <w:bottom w:val="single" w:sz="4" w:color="C8D9DC"/>
+              <w:right w:val="single" w:sz="4" w:color="C8D9DC"/>
+              <w:insideH w:val="single" w:sz="4" w:color="C8D9DC"/>
+              <w:insideV w:val="single" w:sz="4" w:color="C8D9DC"/>
             </w:tcBorders>
+            <w:vAlign w:val="center"/>
           </w:tcPr>
           <w:p>
             <w:r>
-              <w:t>5 explain; 7 inspect site/sources; 10 agent; 10 tests; 8 citation/access; 5 evidence</w:t>
+              <w:rPr>
+                <w:color w:val="102B3E"/>
+                <w:sz w:val="17"/>
+              </w:rPr>
+              <w:t>Slides 125–143</w:t>
+            </w:r>
+          </w:p>
+        </w:tc>
+        <w:tc>
+          <w:tcPr>
+            <w:tcW w:type="dxa" w:w="2033"/>
+            <w:shd w:fill="EAF3F4"/>
+            <w:tcBorders>
+              <w:top w:val="single" w:sz="4" w:color="C8D9DC"/>
+              <w:left w:val="single" w:sz="4" w:color="C8D9DC"/>
+              <w:bottom w:val="single" w:sz="4" w:color="C8D9DC"/>
+              <w:right w:val="single" w:sz="4" w:color="C8D9DC"/>
+              <w:insideH w:val="single" w:sz="4" w:color="C8D9DC"/>
+              <w:insideV w:val="single" w:sz="4" w:color="C8D9DC"/>
+            </w:tcBorders>
+            <w:vAlign w:val="center"/>
+          </w:tcPr>
+          <w:p>
+            <w:r>
+              <w:rPr>
+                <w:color w:val="102B3E"/>
+                <w:sz w:val="17"/>
+              </w:rPr>
+              <w:t>Knowledge library; folder-scoped agent; citations, permissions and checked handoff</w:t>
+            </w:r>
+          </w:p>
+        </w:tc>
+        <w:tc>
+          <w:tcPr>
+            <w:tcW w:type="dxa" w:w="2033"/>
+            <w:shd w:fill="EAF3F4"/>
+            <w:tcBorders>
+              <w:top w:val="single" w:sz="4" w:color="C8D9DC"/>
+              <w:left w:val="single" w:sz="4" w:color="C8D9DC"/>
+              <w:bottom w:val="single" w:sz="4" w:color="C8D9DC"/>
+              <w:right w:val="single" w:sz="4" w:color="C8D9DC"/>
+              <w:insideH w:val="single" w:sz="4" w:color="C8D9DC"/>
+              <w:insideV w:val="single" w:sz="4" w:color="C8D9DC"/>
+            </w:tcBorders>
+            <w:vAlign w:val="center"/>
+          </w:tcPr>
+          <w:p>
+            <w:r>
+              <w:rPr>
+                <w:color w:val="102B3E"/>
+                <w:sz w:val="17"/>
+              </w:rPr>
+              <w:t>LO6</w:t>
             </w:r>
           </w:p>
         </w:tc>
@@ -667,22 +1576,23 @@
       <w:tr>
         <w:tc>
           <w:tcPr>
-            <w:tcW w:type="dxa" w:w="3250"/>
+            <w:tcW w:type="dxa" w:w="2033"/>
+            <w:shd w:fill="FFFFFF"/>
             <w:tcBorders>
-              <w:top w:val="single" w:sz="4" w:color="D9D9D9"/>
-              <w:left w:val="single" w:sz="4" w:color="D9D9D9"/>
-              <w:bottom w:val="single" w:sz="4" w:color="D9D9D9"/>
-              <w:right w:val="single" w:sz="4" w:color="D9D9D9"/>
+              <w:top w:val="single" w:sz="4" w:color="C8D9DC"/>
+              <w:left w:val="single" w:sz="4" w:color="C8D9DC"/>
+              <w:bottom w:val="single" w:sz="4" w:color="C8D9DC"/>
+              <w:right w:val="single" w:sz="4" w:color="C8D9DC"/>
+              <w:insideH w:val="single" w:sz="4" w:color="C8D9DC"/>
+              <w:insideV w:val="single" w:sz="4" w:color="C8D9DC"/>
             </w:tcBorders>
+            <w:vAlign w:val="center"/>
           </w:tcPr>
           <w:p>
-            <w:pPr>
-              <w:spacing w:after="100" w:before="100"/>
-            </w:pPr>
             <w:r>
               <w:rPr>
-                <w:b w:val="0"/>
-                <w:sz w:val="18"/>
+                <w:color w:val="102B3E"/>
+                <w:sz w:val="17"/>
               </w:rPr>
               <w:t>16:15–16:45</w:t>
             </w:r>
@@ -690,33 +1600,97 @@
         </w:tc>
         <w:tc>
           <w:tcPr>
-            <w:tcW w:type="dxa" w:w="3250"/>
+            <w:tcW w:type="dxa" w:w="2033"/>
+            <w:shd w:fill="FFFFFF"/>
             <w:tcBorders>
-              <w:top w:val="single" w:sz="4" w:color="D9D9D9"/>
-              <w:left w:val="single" w:sz="4" w:color="D9D9D9"/>
-              <w:bottom w:val="single" w:sz="4" w:color="D9D9D9"/>
-              <w:right w:val="single" w:sz="4" w:color="D9D9D9"/>
+              <w:top w:val="single" w:sz="4" w:color="C8D9DC"/>
+              <w:left w:val="single" w:sz="4" w:color="C8D9DC"/>
+              <w:bottom w:val="single" w:sz="4" w:color="C8D9DC"/>
+              <w:right w:val="single" w:sz="4" w:color="C8D9DC"/>
+              <w:insideH w:val="single" w:sz="4" w:color="C8D9DC"/>
+              <w:insideV w:val="single" w:sz="4" w:color="C8D9DC"/>
             </w:tcBorders>
+            <w:vAlign w:val="center"/>
           </w:tcPr>
           <w:p>
             <w:r>
-              <w:t>6 · Apply the 7-Step AI Security Framework</w:t>
+              <w:rPr>
+                <w:color w:val="102B3E"/>
+                <w:sz w:val="17"/>
+              </w:rPr>
+              <w:t>6 · AI security</w:t>
             </w:r>
           </w:p>
         </w:tc>
         <w:tc>
           <w:tcPr>
-            <w:tcW w:type="dxa" w:w="3250"/>
+            <w:tcW w:type="dxa" w:w="2033"/>
+            <w:shd w:fill="FFFFFF"/>
             <w:tcBorders>
-              <w:top w:val="single" w:sz="4" w:color="D9D9D9"/>
-              <w:left w:val="single" w:sz="4" w:color="D9D9D9"/>
-              <w:bottom w:val="single" w:sz="4" w:color="D9D9D9"/>
-              <w:right w:val="single" w:sz="4" w:color="D9D9D9"/>
+              <w:top w:val="single" w:sz="4" w:color="C8D9DC"/>
+              <w:left w:val="single" w:sz="4" w:color="C8D9DC"/>
+              <w:bottom w:val="single" w:sz="4" w:color="C8D9DC"/>
+              <w:right w:val="single" w:sz="4" w:color="C8D9DC"/>
+              <w:insideH w:val="single" w:sz="4" w:color="C8D9DC"/>
+              <w:insideV w:val="single" w:sz="4" w:color="C8D9DC"/>
             </w:tcBorders>
+            <w:vAlign w:val="center"/>
           </w:tcPr>
           <w:p>
             <w:r>
-              <w:t>20 applied seven-step review and release decision; 10 personal prompt toolkit</w:t>
+              <w:rPr>
+                <w:color w:val="102B3E"/>
+                <w:sz w:val="17"/>
+              </w:rPr>
+              <w:t>Slides 144–156</w:t>
+            </w:r>
+          </w:p>
+        </w:tc>
+        <w:tc>
+          <w:tcPr>
+            <w:tcW w:type="dxa" w:w="2033"/>
+            <w:shd w:fill="FFFFFF"/>
+            <w:tcBorders>
+              <w:top w:val="single" w:sz="4" w:color="C8D9DC"/>
+              <w:left w:val="single" w:sz="4" w:color="C8D9DC"/>
+              <w:bottom w:val="single" w:sz="4" w:color="C8D9DC"/>
+              <w:right w:val="single" w:sz="4" w:color="C8D9DC"/>
+              <w:insideH w:val="single" w:sz="4" w:color="C8D9DC"/>
+              <w:insideV w:val="single" w:sz="4" w:color="C8D9DC"/>
+            </w:tcBorders>
+            <w:vAlign w:val="center"/>
+          </w:tcPr>
+          <w:p>
+            <w:r>
+              <w:rPr>
+                <w:color w:val="102B3E"/>
+                <w:sz w:val="17"/>
+              </w:rPr>
+              <w:t>Apply seven controls and consolidate personal toolkit</w:t>
+            </w:r>
+          </w:p>
+        </w:tc>
+        <w:tc>
+          <w:tcPr>
+            <w:tcW w:type="dxa" w:w="2033"/>
+            <w:shd w:fill="FFFFFF"/>
+            <w:tcBorders>
+              <w:top w:val="single" w:sz="4" w:color="C8D9DC"/>
+              <w:left w:val="single" w:sz="4" w:color="C8D9DC"/>
+              <w:bottom w:val="single" w:sz="4" w:color="C8D9DC"/>
+              <w:right w:val="single" w:sz="4" w:color="C8D9DC"/>
+              <w:insideH w:val="single" w:sz="4" w:color="C8D9DC"/>
+              <w:insideV w:val="single" w:sz="4" w:color="C8D9DC"/>
+            </w:tcBorders>
+            <w:vAlign w:val="center"/>
+          </w:tcPr>
+          <w:p>
+            <w:r>
+              <w:rPr>
+                <w:color w:val="102B3E"/>
+                <w:sz w:val="17"/>
+              </w:rPr>
+              <w:t>LO7</w:t>
             </w:r>
           </w:p>
         </w:tc>
@@ -724,22 +1698,23 @@
       <w:tr>
         <w:tc>
           <w:tcPr>
-            <w:tcW w:type="dxa" w:w="3250"/>
+            <w:tcW w:type="dxa" w:w="2033"/>
+            <w:shd w:fill="EAF3F4"/>
             <w:tcBorders>
-              <w:top w:val="single" w:sz="4" w:color="D9D9D9"/>
-              <w:left w:val="single" w:sz="4" w:color="D9D9D9"/>
-              <w:bottom w:val="single" w:sz="4" w:color="D9D9D9"/>
-              <w:right w:val="single" w:sz="4" w:color="D9D9D9"/>
+              <w:top w:val="single" w:sz="4" w:color="C8D9DC"/>
+              <w:left w:val="single" w:sz="4" w:color="C8D9DC"/>
+              <w:bottom w:val="single" w:sz="4" w:color="C8D9DC"/>
+              <w:right w:val="single" w:sz="4" w:color="C8D9DC"/>
+              <w:insideH w:val="single" w:sz="4" w:color="C8D9DC"/>
+              <w:insideV w:val="single" w:sz="4" w:color="C8D9DC"/>
             </w:tcBorders>
+            <w:vAlign w:val="center"/>
           </w:tcPr>
           <w:p>
-            <w:pPr>
-              <w:spacing w:after="100" w:before="100"/>
-            </w:pPr>
             <w:r>
               <w:rPr>
-                <w:b w:val="0"/>
-                <w:sz w:val="18"/>
+                <w:color w:val="102B3E"/>
+                <w:sz w:val="17"/>
               </w:rPr>
               <w:t>16:45–17:00</w:t>
             </w:r>
@@ -747,47 +1722,520 @@
         </w:tc>
         <w:tc>
           <w:tcPr>
-            <w:tcW w:type="dxa" w:w="3250"/>
+            <w:tcW w:type="dxa" w:w="2033"/>
+            <w:shd w:fill="EAF3F4"/>
             <w:tcBorders>
-              <w:top w:val="single" w:sz="4" w:color="D9D9D9"/>
-              <w:left w:val="single" w:sz="4" w:color="D9D9D9"/>
-              <w:bottom w:val="single" w:sz="4" w:color="D9D9D9"/>
-              <w:right w:val="single" w:sz="4" w:color="D9D9D9"/>
+              <w:top w:val="single" w:sz="4" w:color="C8D9DC"/>
+              <w:left w:val="single" w:sz="4" w:color="C8D9DC"/>
+              <w:bottom w:val="single" w:sz="4" w:color="C8D9DC"/>
+              <w:right w:val="single" w:sz="4" w:color="C8D9DC"/>
+              <w:insideH w:val="single" w:sz="4" w:color="C8D9DC"/>
+              <w:insideV w:val="single" w:sz="4" w:color="C8D9DC"/>
             </w:tcBorders>
+            <w:vAlign w:val="center"/>
           </w:tcPr>
           <w:p>
-            <w:pPr>
-              <w:spacing w:after="100" w:before="100"/>
-            </w:pPr>
             <w:r>
               <w:rPr>
-                <w:b w:val="0"/>
-                <w:sz w:val="18"/>
+                <w:color w:val="102B3E"/>
+                <w:sz w:val="17"/>
               </w:rPr>
-              <w:t>Closing and Q&amp;A</w:t>
+              <w:t>Closing</w:t>
             </w:r>
           </w:p>
         </w:tc>
         <w:tc>
           <w:tcPr>
-            <w:tcW w:type="dxa" w:w="3250"/>
+            <w:tcW w:type="dxa" w:w="2033"/>
+            <w:shd w:fill="EAF3F4"/>
             <w:tcBorders>
-              <w:top w:val="single" w:sz="4" w:color="D9D9D9"/>
-              <w:left w:val="single" w:sz="4" w:color="D9D9D9"/>
-              <w:bottom w:val="single" w:sz="4" w:color="D9D9D9"/>
-              <w:right w:val="single" w:sz="4" w:color="D9D9D9"/>
+              <w:top w:val="single" w:sz="4" w:color="C8D9DC"/>
+              <w:left w:val="single" w:sz="4" w:color="C8D9DC"/>
+              <w:bottom w:val="single" w:sz="4" w:color="C8D9DC"/>
+              <w:right w:val="single" w:sz="4" w:color="C8D9DC"/>
+              <w:insideH w:val="single" w:sz="4" w:color="C8D9DC"/>
+              <w:insideV w:val="single" w:sz="4" w:color="C8D9DC"/>
             </w:tcBorders>
+            <w:vAlign w:val="center"/>
           </w:tcPr>
           <w:p>
-            <w:pPr>
-              <w:spacing w:after="100" w:before="100"/>
-            </w:pPr>
             <w:r>
               <w:rPr>
-                <w:b w:val="0"/>
+                <w:color w:val="102B3E"/>
+                <w:sz w:val="17"/>
+              </w:rPr>
+              <w:t>Slides 157–162</w:t>
+            </w:r>
+          </w:p>
+        </w:tc>
+        <w:tc>
+          <w:tcPr>
+            <w:tcW w:type="dxa" w:w="2033"/>
+            <w:shd w:fill="EAF3F4"/>
+            <w:tcBorders>
+              <w:top w:val="single" w:sz="4" w:color="C8D9DC"/>
+              <w:left w:val="single" w:sz="4" w:color="C8D9DC"/>
+              <w:bottom w:val="single" w:sz="4" w:color="C8D9DC"/>
+              <w:right w:val="single" w:sz="4" w:color="C8D9DC"/>
+              <w:insideH w:val="single" w:sz="4" w:color="C8D9DC"/>
+              <w:insideV w:val="single" w:sz="4" w:color="C8D9DC"/>
+            </w:tcBorders>
+            <w:vAlign w:val="center"/>
+          </w:tcPr>
+          <w:p>
+            <w:r>
+              <w:rPr>
+                <w:color w:val="102B3E"/>
+                <w:sz w:val="17"/>
+              </w:rPr>
+              <w:t>Outcome review, next action and Q&amp;A</w:t>
+            </w:r>
+          </w:p>
+        </w:tc>
+        <w:tc>
+          <w:tcPr>
+            <w:tcW w:type="dxa" w:w="2033"/>
+            <w:shd w:fill="EAF3F4"/>
+            <w:tcBorders>
+              <w:top w:val="single" w:sz="4" w:color="C8D9DC"/>
+              <w:left w:val="single" w:sz="4" w:color="C8D9DC"/>
+              <w:bottom w:val="single" w:sz="4" w:color="C8D9DC"/>
+              <w:right w:val="single" w:sz="4" w:color="C8D9DC"/>
+              <w:insideH w:val="single" w:sz="4" w:color="C8D9DC"/>
+              <w:insideV w:val="single" w:sz="4" w:color="C8D9DC"/>
+            </w:tcBorders>
+            <w:vAlign w:val="center"/>
+          </w:tcPr>
+          <w:p>
+            <w:r>
+              <w:rPr>
+                <w:color w:val="102B3E"/>
+                <w:sz w:val="17"/>
+              </w:rPr>
+              <w:t>All</w:t>
+            </w:r>
+          </w:p>
+        </w:tc>
+      </w:tr>
+    </w:tbl>
+    <w:p>
+      <w:r>
+        <w:br w:type="page"/>
+      </w:r>
+    </w:p>
+    <w:p>
+      <w:pPr>
+        <w:pStyle w:val="Heading1"/>
+      </w:pPr>
+      <w:r>
+        <w:t>Module 3 methodology and lab allocation</w:t>
+      </w:r>
+    </w:p>
+    <w:tbl>
+      <w:tblPr>
+        <w:tblW w:type="auto" w:w="0"/>
+        <w:jc w:val="center"/>
+        <w:tblLayout w:type="autofit"/>
+        <w:tblLook w:firstColumn="1" w:firstRow="1" w:lastColumn="0" w:lastRow="0" w:noHBand="0" w:noVBand="1" w:val="04A0"/>
+      </w:tblPr>
+      <w:tblGrid>
+        <w:gridCol w:w="2541"/>
+        <w:gridCol w:w="2541"/>
+        <w:gridCol w:w="2541"/>
+        <w:gridCol w:w="2541"/>
+      </w:tblGrid>
+      <w:tr>
+        <w:tc>
+          <w:tcPr>
+            <w:tcW w:type="dxa" w:w="2541"/>
+            <w:shd w:fill="078897"/>
+            <w:tcBorders>
+              <w:top w:val="single" w:sz="4" w:color="C8D9DC"/>
+              <w:left w:val="single" w:sz="4" w:color="C8D9DC"/>
+              <w:bottom w:val="single" w:sz="4" w:color="C8D9DC"/>
+              <w:right w:val="single" w:sz="4" w:color="C8D9DC"/>
+              <w:insideH w:val="single" w:sz="4" w:color="C8D9DC"/>
+              <w:insideV w:val="single" w:sz="4" w:color="C8D9DC"/>
+            </w:tcBorders>
+            <w:vAlign w:val="center"/>
+          </w:tcPr>
+          <w:p>
+            <w:r>
+              <w:rPr>
+                <w:b/>
+                <w:color w:val="FFFFFF"/>
                 <w:sz w:val="18"/>
               </w:rPr>
-              <w:t>10 recap; 5 next action</w:t>
+              <w:t>Sequence</w:t>
+            </w:r>
+          </w:p>
+        </w:tc>
+        <w:tc>
+          <w:tcPr>
+            <w:tcW w:type="dxa" w:w="2541"/>
+            <w:shd w:fill="078897"/>
+            <w:tcBorders>
+              <w:top w:val="single" w:sz="4" w:color="C8D9DC"/>
+              <w:left w:val="single" w:sz="4" w:color="C8D9DC"/>
+              <w:bottom w:val="single" w:sz="4" w:color="C8D9DC"/>
+              <w:right w:val="single" w:sz="4" w:color="C8D9DC"/>
+              <w:insideH w:val="single" w:sz="4" w:color="C8D9DC"/>
+              <w:insideV w:val="single" w:sz="4" w:color="C8D9DC"/>
+            </w:tcBorders>
+            <w:vAlign w:val="center"/>
+          </w:tcPr>
+          <w:p>
+            <w:r>
+              <w:rPr>
+                <w:b/>
+                <w:color w:val="FFFFFF"/>
+                <w:sz w:val="18"/>
+              </w:rPr>
+              <w:t>Concepts taught before activity</w:t>
+            </w:r>
+          </w:p>
+        </w:tc>
+        <w:tc>
+          <w:tcPr>
+            <w:tcW w:type="dxa" w:w="2541"/>
+            <w:shd w:fill="078897"/>
+            <w:tcBorders>
+              <w:top w:val="single" w:sz="4" w:color="C8D9DC"/>
+              <w:left w:val="single" w:sz="4" w:color="C8D9DC"/>
+              <w:bottom w:val="single" w:sz="4" w:color="C8D9DC"/>
+              <w:right w:val="single" w:sz="4" w:color="C8D9DC"/>
+              <w:insideH w:val="single" w:sz="4" w:color="C8D9DC"/>
+              <w:insideV w:val="single" w:sz="4" w:color="C8D9DC"/>
+            </w:tcBorders>
+            <w:vAlign w:val="center"/>
+          </w:tcPr>
+          <w:p>
+            <w:r>
+              <w:rPr>
+                <w:b/>
+                <w:color w:val="FFFFFF"/>
+                <w:sz w:val="18"/>
+              </w:rPr>
+              <w:t>Guided activity</w:t>
+            </w:r>
+          </w:p>
+        </w:tc>
+        <w:tc>
+          <w:tcPr>
+            <w:tcW w:type="dxa" w:w="2541"/>
+            <w:shd w:fill="078897"/>
+            <w:tcBorders>
+              <w:top w:val="single" w:sz="4" w:color="C8D9DC"/>
+              <w:left w:val="single" w:sz="4" w:color="C8D9DC"/>
+              <w:bottom w:val="single" w:sz="4" w:color="C8D9DC"/>
+              <w:right w:val="single" w:sz="4" w:color="C8D9DC"/>
+              <w:insideH w:val="single" w:sz="4" w:color="C8D9DC"/>
+              <w:insideV w:val="single" w:sz="4" w:color="C8D9DC"/>
+            </w:tcBorders>
+            <w:vAlign w:val="center"/>
+          </w:tcPr>
+          <w:p>
+            <w:r>
+              <w:rPr>
+                <w:b/>
+                <w:color w:val="FFFFFF"/>
+                <w:sz w:val="18"/>
+              </w:rPr>
+              <w:t>Evidence</w:t>
+            </w:r>
+          </w:p>
+        </w:tc>
+      </w:tr>
+      <w:tr>
+        <w:tc>
+          <w:tcPr>
+            <w:tcW w:type="dxa" w:w="2541"/>
+            <w:shd w:fill="FFFFFF"/>
+            <w:tcBorders>
+              <w:top w:val="single" w:sz="4" w:color="C8D9DC"/>
+              <w:left w:val="single" w:sz="4" w:color="C8D9DC"/>
+              <w:bottom w:val="single" w:sz="4" w:color="C8D9DC"/>
+              <w:right w:val="single" w:sz="4" w:color="C8D9DC"/>
+              <w:insideH w:val="single" w:sz="4" w:color="C8D9DC"/>
+              <w:insideV w:val="single" w:sz="4" w:color="C8D9DC"/>
+            </w:tcBorders>
+            <w:vAlign w:val="center"/>
+          </w:tcPr>
+          <w:p>
+            <w:r>
+              <w:rPr>
+                <w:color w:val="102B3E"/>
+                <w:sz w:val="17"/>
+              </w:rPr>
+              <w:t>FMEA</w:t>
+            </w:r>
+          </w:p>
+        </w:tc>
+        <w:tc>
+          <w:tcPr>
+            <w:tcW w:type="dxa" w:w="2541"/>
+            <w:shd w:fill="FFFFFF"/>
+            <w:tcBorders>
+              <w:top w:val="single" w:sz="4" w:color="C8D9DC"/>
+              <w:left w:val="single" w:sz="4" w:color="C8D9DC"/>
+              <w:bottom w:val="single" w:sz="4" w:color="C8D9DC"/>
+              <w:right w:val="single" w:sz="4" w:color="C8D9DC"/>
+              <w:insideH w:val="single" w:sz="4" w:color="C8D9DC"/>
+              <w:insideV w:val="single" w:sz="4" w:color="C8D9DC"/>
+            </w:tcBorders>
+            <w:vAlign w:val="center"/>
+          </w:tcPr>
+          <w:p>
+            <w:r>
+              <w:rPr>
+                <w:color w:val="102B3E"/>
+                <w:sz w:val="17"/>
+              </w:rPr>
+              <w:t>Purpose/use; function, mode, effect, cause, control; S/O/D; RPN; severity gate; action lifecycle</w:t>
+            </w:r>
+          </w:p>
+        </w:tc>
+        <w:tc>
+          <w:tcPr>
+            <w:tcW w:type="dxa" w:w="2541"/>
+            <w:shd w:fill="FFFFFF"/>
+            <w:tcBorders>
+              <w:top w:val="single" w:sz="4" w:color="C8D9DC"/>
+              <w:left w:val="single" w:sz="4" w:color="C8D9DC"/>
+              <w:bottom w:val="single" w:sz="4" w:color="C8D9DC"/>
+              <w:right w:val="single" w:sz="4" w:color="C8D9DC"/>
+              <w:insideH w:val="single" w:sz="4" w:color="C8D9DC"/>
+              <w:insideV w:val="single" w:sz="4" w:color="C8D9DC"/>
+            </w:tcBorders>
+            <w:vAlign w:val="center"/>
+          </w:tcPr>
+          <w:p>
+            <w:r>
+              <w:rPr>
+                <w:color w:val="102B3E"/>
+                <w:sz w:val="17"/>
+              </w:rPr>
+              <w:t>Lab 3.1 · 20 min</w:t>
+            </w:r>
+          </w:p>
+        </w:tc>
+        <w:tc>
+          <w:tcPr>
+            <w:tcW w:type="dxa" w:w="2541"/>
+            <w:shd w:fill="FFFFFF"/>
+            <w:tcBorders>
+              <w:top w:val="single" w:sz="4" w:color="C8D9DC"/>
+              <w:left w:val="single" w:sz="4" w:color="C8D9DC"/>
+              <w:bottom w:val="single" w:sz="4" w:color="C8D9DC"/>
+              <w:right w:val="single" w:sz="4" w:color="C8D9DC"/>
+              <w:insideH w:val="single" w:sz="4" w:color="C8D9DC"/>
+              <w:insideV w:val="single" w:sz="4" w:color="C8D9DC"/>
+            </w:tcBorders>
+            <w:vAlign w:val="center"/>
+          </w:tcPr>
+          <w:p>
+            <w:r>
+              <w:rPr>
+                <w:color w:val="102B3E"/>
+                <w:sz w:val="17"/>
+              </w:rPr>
+              <w:t>FM01=140; FM04 Severity=9; ranked table</w:t>
+            </w:r>
+          </w:p>
+        </w:tc>
+      </w:tr>
+      <w:tr>
+        <w:tc>
+          <w:tcPr>
+            <w:tcW w:type="dxa" w:w="2541"/>
+            <w:shd w:fill="EAF3F4"/>
+            <w:tcBorders>
+              <w:top w:val="single" w:sz="4" w:color="C8D9DC"/>
+              <w:left w:val="single" w:sz="4" w:color="C8D9DC"/>
+              <w:bottom w:val="single" w:sz="4" w:color="C8D9DC"/>
+              <w:right w:val="single" w:sz="4" w:color="C8D9DC"/>
+              <w:insideH w:val="single" w:sz="4" w:color="C8D9DC"/>
+              <w:insideV w:val="single" w:sz="4" w:color="C8D9DC"/>
+            </w:tcBorders>
+            <w:vAlign w:val="center"/>
+          </w:tcPr>
+          <w:p>
+            <w:r>
+              <w:rPr>
+                <w:color w:val="102B3E"/>
+                <w:sz w:val="17"/>
+              </w:rPr>
+              <w:t>DMAIC then SPC</w:t>
+            </w:r>
+          </w:p>
+        </w:tc>
+        <w:tc>
+          <w:tcPr>
+            <w:tcW w:type="dxa" w:w="2541"/>
+            <w:shd w:fill="EAF3F4"/>
+            <w:tcBorders>
+              <w:top w:val="single" w:sz="4" w:color="C8D9DC"/>
+              <w:left w:val="single" w:sz="4" w:color="C8D9DC"/>
+              <w:bottom w:val="single" w:sz="4" w:color="C8D9DC"/>
+              <w:right w:val="single" w:sz="4" w:color="C8D9DC"/>
+              <w:insideH w:val="single" w:sz="4" w:color="C8D9DC"/>
+              <w:insideV w:val="single" w:sz="4" w:color="C8D9DC"/>
+            </w:tcBorders>
+            <w:vAlign w:val="center"/>
+          </w:tcPr>
+          <w:p>
+            <w:r>
+              <w:rPr>
+                <w:color w:val="102B3E"/>
+                <w:sz w:val="17"/>
+              </w:rPr>
+              <w:t>Six Sigma; five phases; Pareto; fishbone/Ishikawa; 5-Whys; chart anatomy; common/special cause; limits; Cp/Cpk</w:t>
+            </w:r>
+          </w:p>
+        </w:tc>
+        <w:tc>
+          <w:tcPr>
+            <w:tcW w:type="dxa" w:w="2541"/>
+            <w:shd w:fill="EAF3F4"/>
+            <w:tcBorders>
+              <w:top w:val="single" w:sz="4" w:color="C8D9DC"/>
+              <w:left w:val="single" w:sz="4" w:color="C8D9DC"/>
+              <w:bottom w:val="single" w:sz="4" w:color="C8D9DC"/>
+              <w:right w:val="single" w:sz="4" w:color="C8D9DC"/>
+              <w:insideH w:val="single" w:sz="4" w:color="C8D9DC"/>
+              <w:insideV w:val="single" w:sz="4" w:color="C8D9DC"/>
+            </w:tcBorders>
+            <w:vAlign w:val="center"/>
+          </w:tcPr>
+          <w:p>
+            <w:r>
+              <w:rPr>
+                <w:color w:val="102B3E"/>
+                <w:sz w:val="17"/>
+              </w:rPr>
+              <w:t>Lab 3.2 · 35 min</w:t>
+            </w:r>
+          </w:p>
+        </w:tc>
+        <w:tc>
+          <w:tcPr>
+            <w:tcW w:type="dxa" w:w="2541"/>
+            <w:shd w:fill="EAF3F4"/>
+            <w:tcBorders>
+              <w:top w:val="single" w:sz="4" w:color="C8D9DC"/>
+              <w:left w:val="single" w:sz="4" w:color="C8D9DC"/>
+              <w:bottom w:val="single" w:sz="4" w:color="C8D9DC"/>
+              <w:right w:val="single" w:sz="4" w:color="C8D9DC"/>
+              <w:insideH w:val="single" w:sz="4" w:color="C8D9DC"/>
+              <w:insideV w:val="single" w:sz="4" w:color="C8D9DC"/>
+            </w:tcBorders>
+            <w:vAlign w:val="center"/>
+          </w:tcPr>
+          <w:p>
+            <w:r>
+              <w:rPr>
+                <w:color w:val="102B3E"/>
+                <w:sz w:val="17"/>
+              </w:rPr>
+              <w:t>9.0% vs 3.5%; chart, capability boundary and report</w:t>
+            </w:r>
+          </w:p>
+        </w:tc>
+      </w:tr>
+      <w:tr>
+        <w:tc>
+          <w:tcPr>
+            <w:tcW w:type="dxa" w:w="2541"/>
+            <w:shd w:fill="FFFFFF"/>
+            <w:tcBorders>
+              <w:top w:val="single" w:sz="4" w:color="C8D9DC"/>
+              <w:left w:val="single" w:sz="4" w:color="C8D9DC"/>
+              <w:bottom w:val="single" w:sz="4" w:color="C8D9DC"/>
+              <w:right w:val="single" w:sz="4" w:color="C8D9DC"/>
+              <w:insideH w:val="single" w:sz="4" w:color="C8D9DC"/>
+              <w:insideV w:val="single" w:sz="4" w:color="C8D9DC"/>
+            </w:tcBorders>
+            <w:vAlign w:val="center"/>
+          </w:tcPr>
+          <w:p>
+            <w:r>
+              <w:rPr>
+                <w:color w:val="102B3E"/>
+                <w:sz w:val="17"/>
+              </w:rPr>
+              <w:t>Specification pack</w:t>
+            </w:r>
+          </w:p>
+        </w:tc>
+        <w:tc>
+          <w:tcPr>
+            <w:tcW w:type="dxa" w:w="2541"/>
+            <w:shd w:fill="FFFFFF"/>
+            <w:tcBorders>
+              <w:top w:val="single" w:sz="4" w:color="C8D9DC"/>
+              <w:left w:val="single" w:sz="4" w:color="C8D9DC"/>
+              <w:bottom w:val="single" w:sz="4" w:color="C8D9DC"/>
+              <w:right w:val="single" w:sz="4" w:color="C8D9DC"/>
+              <w:insideH w:val="single" w:sz="4" w:color="C8D9DC"/>
+              <w:insideV w:val="single" w:sz="4" w:color="C8D9DC"/>
+            </w:tcBorders>
+            <w:vAlign w:val="center"/>
+          </w:tcPr>
+          <w:p>
+            <w:r>
+              <w:rPr>
+                <w:color w:val="102B3E"/>
+                <w:sz w:val="17"/>
+              </w:rPr>
+              <w:t>Requirements, acceptance tests and document traceability</w:t>
+            </w:r>
+          </w:p>
+        </w:tc>
+        <w:tc>
+          <w:tcPr>
+            <w:tcW w:type="dxa" w:w="2541"/>
+            <w:shd w:fill="FFFFFF"/>
+            <w:tcBorders>
+              <w:top w:val="single" w:sz="4" w:color="C8D9DC"/>
+              <w:left w:val="single" w:sz="4" w:color="C8D9DC"/>
+              <w:bottom w:val="single" w:sz="4" w:color="C8D9DC"/>
+              <w:right w:val="single" w:sz="4" w:color="C8D9DC"/>
+              <w:insideH w:val="single" w:sz="4" w:color="C8D9DC"/>
+              <w:insideV w:val="single" w:sz="4" w:color="C8D9DC"/>
+            </w:tcBorders>
+            <w:vAlign w:val="center"/>
+          </w:tcPr>
+          <w:p>
+            <w:r>
+              <w:rPr>
+                <w:color w:val="102B3E"/>
+                <w:sz w:val="17"/>
+              </w:rPr>
+              <w:t>Lab 3.3 · 20 min</w:t>
+            </w:r>
+          </w:p>
+        </w:tc>
+        <w:tc>
+          <w:tcPr>
+            <w:tcW w:type="dxa" w:w="2541"/>
+            <w:shd w:fill="FFFFFF"/>
+            <w:tcBorders>
+              <w:top w:val="single" w:sz="4" w:color="C8D9DC"/>
+              <w:left w:val="single" w:sz="4" w:color="C8D9DC"/>
+              <w:bottom w:val="single" w:sz="4" w:color="C8D9DC"/>
+              <w:right w:val="single" w:sz="4" w:color="C8D9DC"/>
+              <w:insideH w:val="single" w:sz="4" w:color="C8D9DC"/>
+              <w:insideV w:val="single" w:sz="4" w:color="C8D9DC"/>
+            </w:tcBorders>
+            <w:vAlign w:val="center"/>
+          </w:tcPr>
+          <w:p>
+            <w:r>
+              <w:rPr>
+                <w:color w:val="102B3E"/>
+                <w:sz w:val="17"/>
+              </w:rPr>
+              <w:t>Specification, checklist, SOP and troubleshooting guide</w:t>
             </w:r>
           </w:p>
         </w:tc>
@@ -795,245 +2243,10 @@
     </w:tbl>
     <w:p>
       <w:pPr>
-        <w:pStyle w:val="Heading2"/>
+        <w:spacing w:after="100"/>
       </w:pPr>
       <w:r>
-        <w:t>Only three short guided exercises</w:t>
-      </w:r>
-    </w:p>
-    <w:p>
-      <w:r>
-        <w:t>Use the separate Starter.xlsx in each lab. Each workbook contains one small source table and one prompt. Open Worked-Reference.xlsx only after the learner has checked the Copilot draft.</w:t>
-      </w:r>
-    </w:p>
-    <w:p>
-      <w:pPr>
-        <w:pStyle w:val="Heading2"/>
-      </w:pPr>
-      <w:r>
-        <w:t>1 · Copilot ecosystem</w:t>
-      </w:r>
-    </w:p>
-    <w:p>
-      <w:r>
-        <w:t>Show the same engineering question in Chat and Excel. Identify which evidence is available in each surface. Complete the access check once; use a paired screen or the supplied worked reference when access cannot be resolved within ten minutes.</w:t>
-      </w:r>
-    </w:p>
-    <w:p>
-      <w:pPr>
-        <w:pStyle w:val="Heading2"/>
-      </w:pPr>
-      <w:r>
-        <w:t>2 · Prompting for engineering documents</w:t>
-      </w:r>
-    </w:p>
-    <w:p>
-      <w:r>
-        <w:t>Teach RISE as the main LO3 framework. R - Role: name the perspective without granting authority. I - Input: name the exact table, document, revision and boundaries. S - Steps: state the calculations, comparisons and checks in order. E - Expectations: specify the output format, evidence, constraints and acceptance test. Demonstrate vague prompt -&gt; RISE prompt -&gt; checked output -&gt; one refinement. Learners apply the same structure to the FMEA, DMAIC and SPC prompts in Module 3.</w:t>
-      </w:r>
-    </w:p>
-    <w:p>
-      <w:pPr/>
-      <w:r>
-        <w:t>LO3 evidence: learners label R, I, S and E in one engineering prompt, use it in Copilot, verify one result, and refine one instruction when the draft is incomplete.</w:t>
-      </w:r>
-    </w:p>
-    <w:p>
-      <w:pPr>
-        <w:pStyle w:val="Heading2"/>
-      </w:pPr>
-      <w:r>
-        <w:t>4 · Copilot and reasoning agents</w:t>
-      </w:r>
-    </w:p>
-    <w:p>
-      <w:r>
-        <w:t>8 min: explain the six-step FMEA-to-report workflow. 15 min: pairs create the IES Pump FMEA Assistant and add the instruction/template. 12 min: run the complete FM01 and missing-Detection tests; refine one instruction. 8 min: human approval and report draft. 12 min: create, publish or share to the approved training audience and record status. 20 min LO5 guided activity: Researcher cited comparison 8 min, Analyst DMAIC analysis 8 min, independent checks and debrief 4 min. Total: 75 minutes.</w:t>
-      </w:r>
-    </w:p>
-    <w:p>
-      <w:pPr>
-        <w:pStyle w:val="Heading2"/>
-      </w:pPr>
-      <w:r>
-        <w:t>LO5 guided activity - Researcher and Analyst</w:t>
-      </w:r>
-    </w:p>
-    <w:p>
-      <w:pPr/>
-      <w:r>
-        <w:t>Learning evidence: use Researcher to create a technical comparison and open one supporting citation. Use Analyst with Lab-02-DMAIC/Starter.xlsx, then independently verify Baseline 36/400 = 9.0%, Pilot 7/200 = 3.5%, change -5.5 percentage points and relative reduction 61.1%.</w:t>
-      </w:r>
-    </w:p>
-    <w:p>
-      <w:pPr/>
-      <w:r>
-        <w:t>Researcher 8 min: select Researcher under Agents, provide TR-401-Training-Extract.pdf and the RISE prompt, review the cited comparison and open one citation. Analyst 8 min: select Analyst, attach the DMAIC workbook, request totals, rates, change, a simple visual, a limitation and a next evidence check. Review 4 min: compare the output with the expected calculations and reject causal or sustained-improvement claims.</w:t>
-      </w:r>
-    </w:p>
-    <w:p>
-      <w:pPr/>
-      <w:r>
-        <w:t>Resources: Trainer-Demonstrations/REASONING-AGENT-PROMPTS.md; Trainer-Demonstrations/REASONING-AGENT-CHECKS.md; https://learn.microsoft.com/en-us/microsoft-365/copilot/researcher-agent; https://support.microsoft.com/en-US/Microsoft-365-Copilot/get-started-with-analyst-in-microsoft-365-copilot</w:t>
-      </w:r>
-    </w:p>
-    <w:p>
-      <w:pPr>
-        <w:pStyle w:val="Heading2"/>
-      </w:pPr>
-      <w:r>
-        <w:t>5 · SharePoint knowledge base and grounded agent</w:t>
-      </w:r>
-    </w:p>
-    <w:p>
-      <w:r>
-        <w:t>5 min: explain SharePoint grounding and the productivity benefit. 7 min: inspect the private IES site and four named synthetic sources. 10 min: create or inspect the folder-scoped agent. 10 min: run supported-fact and missing-evidence tests. 8 min: open one citation and check revision, scope and permissions. 5 min: record evidence and debrief. Total: 45 minutes. If learners lack edit permission, the trainer demonstrates creation and pairs evaluate the tests; record actual execution status. Prepared resource: private site https://tertiaryinfotech.sharepoint.com/sites/IES-GenAI-for-Engineers; Documents/Engineering Knowledge Base; IES Engineering Knowledge Assistant; Trainer-Demonstrations/SHAREPOINT-AGENT-INSTRUCTIONS.md and SHAREPOINT-AGENT-TESTS.md.</w:t>
-      </w:r>
-    </w:p>
-    <w:p>
-      <w:pPr>
-        <w:pStyle w:val="Heading2"/>
-      </w:pPr>
-      <w:r>
-        <w:t>6 · Apply the 7-Step AI Security Framework</w:t>
-      </w:r>
-    </w:p>
-    <w:p>
-      <w:r>
-        <w:t>20 min guided application: use the Module 5 SharePoint-agent answer and complete all seven rows in AI-SECURITY-EVIDENCE-LOG.csv — classify the synthetic data; confirm the private site, source scope and access; inspect the secure prompt; open one citation and reproduce one calculation; record human sign-off; preserve a reconstructable audit trail; and state the containment and reporting response to a security trigger. Make an APPROVED FOR TRAINING USE, RETURN FOR CORRECTION or DO NOT SHARE decision. 10 min: adapt one reusable prompt to carry source, protection, verification and review controls. No additional lab folder.</w:t>
-      </w:r>
-    </w:p>
-    <w:p>
-      <w:r/>
-    </w:p>
-    <w:p>
-      <w:pPr>
-        <w:pStyle w:val="Heading1"/>
-      </w:pPr>
-      <w:r>
-        <w:t>Module 3 · FMEA → DMAIC → SPC | 90 minutes</w:t>
-      </w:r>
-    </w:p>
-    <w:p>
-      <w:pPr>
-        <w:pStyle w:val="Heading2"/>
-      </w:pPr>
-      <w:r>
-        <w:t>11:30–11:45 · Methodology primer</w:t>
-      </w:r>
-    </w:p>
-    <w:p>
-      <w:pPr/>
-      <w:r>
-        <w:t>Explain FMEA and RPN; Six Sigma/DMAIC and its five phases; Pareto, fishbone/Ishikawa and 5-Whys; then SPC, common versus special cause, control charts and Cp/Cpk. Use plain language and one pump example before any Copilot task.</w:t>
-      </w:r>
-    </w:p>
-    <w:p>
-      <w:pPr>
-        <w:pStyle w:val="Heading2"/>
-      </w:pPr>
-      <w:r>
-        <w:t>11:45–12:05 · Lab 1 FMEA</w:t>
-      </w:r>
-    </w:p>
-    <w:p>
-      <w:pPr/>
-      <w:r>
-        <w:t>Open Labs/Lab-01-FMEA/Starter.xlsx. Preserve four supplied rows and ratings; calculate RPN, rank rows and apply the Severity 9 gate. Independent checks: FM01 = 140 and FM04 Severity = 9.</w:t>
-      </w:r>
-    </w:p>
-    <w:p>
-      <w:pPr>
-        <w:pStyle w:val="Heading2"/>
-      </w:pPr>
-      <w:r>
-        <w:t>12:05–12:25 · Lab 2 DMAIC</w:t>
-      </w:r>
-    </w:p>
-    <w:p>
-      <w:pPr/>
-      <w:r>
-        <w:t>Open Labs/Lab-02-DMAIC/Starter.xlsx. Calculate Baseline and Pilot deviation rates and draft five DMAIC rows. Independent checks: 9.0%, 3.5%, and no causal claim. Relate Pareto, fishbone and 5-Whys to the Analyse phase.</w:t>
-      </w:r>
-    </w:p>
-    <w:p>
-      <w:pPr>
-        <w:pStyle w:val="Heading2"/>
-      </w:pPr>
-      <w:r>
-        <w:t>12:25–12:50 · Lab 3 SPC</w:t>
-      </w:r>
-    </w:p>
-    <w:p>
-      <w:pPr/>
-      <w:r>
-        <w:t>Open Labs/Lab-03-SPC/Starter.xlsx. Calculate baseline limits, flag monitoring rows and draft a chart interpretation. Independent check: T10 = 59.4 L/h against the LCL. Distinguish a signal from a specification or diagnosis.</w:t>
-      </w:r>
-    </w:p>
-    <w:p>
-      <w:pPr>
-        <w:pStyle w:val="Heading2"/>
-      </w:pPr>
-      <w:r>
-        <w:t>12:50–13:00 · Shared review</w:t>
-      </w:r>
-    </w:p>
-    <w:p>
-      <w:pPr/>
-      <w:r>
-        <w:t>Each learner states one output, one independent check and one evidence limitation. Stop at 13:00 for lunch. If Copilot stalls for more than two minutes, inspect the Worked-Reference formula and continue the review without extending the block.</w:t>
-      </w:r>
-    </w:p>
-    <w:p>
-      <w:pPr>
-        <w:pStyle w:val="Heading2"/>
-      </w:pPr>
-      <w:r>
-        <w:t>Outcome coverage</w:t>
-      </w:r>
-    </w:p>
-    <w:p>
-      <w:r>
-        <w:t>LO1 methodology: primer and guided Excel review. LO2 documentation: trainer examples and Excel outputs; no independent Word/PPT pack. LO3 prompting: framework, critique and three selected prompts. LO4: guided paired agent build, test and training deployment. LO5: guided Researcher and Analyst activity with citation and calculation evidence. LO6: guided private SharePoint knowledge base, grounded-agent tests and citation verification. LO7: applied seven-step security record, release decision and incident-response trigger. Independent agent deployment is not a completion claim for this shortened delivery.</w:t>
-      </w:r>
-    </w:p>
-    <w:p>
-      <w:pPr>
-        <w:pStyle w:val="Heading2"/>
-      </w:pPr>
-      <w:r>
-        <w:t>Presentation teaching sequence — v3.4</w:t>
-      </w:r>
-    </w:p>
-    <w:p>
-      <w:r>
-        <w:t>Module 1 introduces AI, Copilot and the pump case. Module 2 builds clear, reviewable prompts with RISE and E-MAP. Module 3 follows FMEA → DMAIC → SPC: explain each method before its Copilot in Excel exercise. Module 4 covers the multi-step Copilot Agent and reasoning agents. Module 5 creates and grounds a SharePoint knowledge-base agent. Module 6 applies all seven AI security steps before closing.</w:t>
-      </w:r>
-    </w:p>
-    <w:p>
-      <w:r/>
-    </w:p>
-    <w:p>
-      <w:pPr>
-        <w:pStyle w:val="Heading1"/>
-      </w:pPr>
-      <w:r>
-        <w:t>Using the expanded 259-slide deck</w:t>
-      </w:r>
-    </w:p>
-    <w:p>
-      <w:r>
-        <w:t>Slides 1–138 are the one-day teaching route. Slide 139 introduces optional reference material. Slides 140–259 contain 30 worked examples; they are not additional scheduled labs. Keep the original six-module timetable and the 25/20/20-minute guided Excel exercises.</w:t>
-      </w:r>
-    </w:p>
-    <w:p>
-      <w:r>
-        <w:t>Reference index: FMEA slides 140-163; DMAIC 164-187; SPC 188-219; Prompting 220-239; Agents 240-247; Grounding 248-255; Security 256-259.</w:t>
-      </w:r>
-    </w:p>
-    <w:p>
-      <w:r>
-        <w:t>Each reference example follows data, prompt, illustrative answer and verification. Supporting CSVs, prompts and Worked-Examples.pdf are in Reference-Examples. The trainer demonstrations use the supplied Trainer-Demonstrations pack.</w:t>
+        <w:t>The classroom-case order is fixed: FMEA → DMAIC → SPC. These methods answer different questions and are not a universal lifecycle. Every concept is explained before the corresponding Copilot application. Module 3 stops at 13:00.</w:t>
       </w:r>
     </w:p>
     <w:p>
@@ -1041,124 +2254,1081 @@
         <w:pStyle w:val="Heading1"/>
       </w:pPr>
       <w:r>
-        <w:t>LO2 practical workflow: create the engineering output with Copilot 365</w:t>
+        <w:t>Copilot integration across the day</w:t>
       </w:r>
     </w:p>
+    <w:tbl>
+      <w:tblPr>
+        <w:tblW w:type="auto" w:w="0"/>
+        <w:jc w:val="center"/>
+        <w:tblLayout w:type="autofit"/>
+        <w:tblLook w:firstColumn="1" w:firstRow="1" w:lastColumn="0" w:lastRow="0" w:noHBand="0" w:noVBand="1" w:val="04A0"/>
+      </w:tblPr>
+      <w:tblGrid>
+        <w:gridCol w:w="3389"/>
+        <w:gridCol w:w="3389"/>
+        <w:gridCol w:w="3389"/>
+      </w:tblGrid>
+      <w:tr>
+        <w:tc>
+          <w:tcPr>
+            <w:tcW w:type="dxa" w:w="3389"/>
+            <w:shd w:fill="078897"/>
+            <w:tcBorders>
+              <w:top w:val="single" w:sz="4" w:color="C8D9DC"/>
+              <w:left w:val="single" w:sz="4" w:color="C8D9DC"/>
+              <w:bottom w:val="single" w:sz="4" w:color="C8D9DC"/>
+              <w:right w:val="single" w:sz="4" w:color="C8D9DC"/>
+              <w:insideH w:val="single" w:sz="4" w:color="C8D9DC"/>
+              <w:insideV w:val="single" w:sz="4" w:color="C8D9DC"/>
+            </w:tcBorders>
+            <w:vAlign w:val="center"/>
+          </w:tcPr>
+          <w:p>
+            <w:r>
+              <w:rPr>
+                <w:b/>
+                <w:color w:val="FFFFFF"/>
+                <w:sz w:val="18"/>
+              </w:rPr>
+              <w:t>Module</w:t>
+            </w:r>
+          </w:p>
+        </w:tc>
+        <w:tc>
+          <w:tcPr>
+            <w:tcW w:type="dxa" w:w="3389"/>
+            <w:shd w:fill="078897"/>
+            <w:tcBorders>
+              <w:top w:val="single" w:sz="4" w:color="C8D9DC"/>
+              <w:left w:val="single" w:sz="4" w:color="C8D9DC"/>
+              <w:bottom w:val="single" w:sz="4" w:color="C8D9DC"/>
+              <w:right w:val="single" w:sz="4" w:color="C8D9DC"/>
+              <w:insideH w:val="single" w:sz="4" w:color="C8D9DC"/>
+              <w:insideV w:val="single" w:sz="4" w:color="C8D9DC"/>
+            </w:tcBorders>
+            <w:vAlign w:val="center"/>
+          </w:tcPr>
+          <w:p>
+            <w:r>
+              <w:rPr>
+                <w:b/>
+                <w:color w:val="FFFFFF"/>
+                <w:sz w:val="18"/>
+              </w:rPr>
+              <w:t>Copilot integration</w:t>
+            </w:r>
+          </w:p>
+        </w:tc>
+        <w:tc>
+          <w:tcPr>
+            <w:tcW w:type="dxa" w:w="3389"/>
+            <w:shd w:fill="078897"/>
+            <w:tcBorders>
+              <w:top w:val="single" w:sz="4" w:color="C8D9DC"/>
+              <w:left w:val="single" w:sz="4" w:color="C8D9DC"/>
+              <w:bottom w:val="single" w:sz="4" w:color="C8D9DC"/>
+              <w:right w:val="single" w:sz="4" w:color="C8D9DC"/>
+              <w:insideH w:val="single" w:sz="4" w:color="C8D9DC"/>
+              <w:insideV w:val="single" w:sz="4" w:color="C8D9DC"/>
+            </w:tcBorders>
+            <w:vAlign w:val="center"/>
+          </w:tcPr>
+          <w:p>
+            <w:r>
+              <w:rPr>
+                <w:b/>
+                <w:color w:val="FFFFFF"/>
+                <w:sz w:val="18"/>
+              </w:rPr>
+              <w:t>Human verification</w:t>
+            </w:r>
+          </w:p>
+        </w:tc>
+      </w:tr>
+      <w:tr>
+        <w:tc>
+          <w:tcPr>
+            <w:tcW w:type="dxa" w:w="3389"/>
+            <w:shd w:fill="FFFFFF"/>
+            <w:tcBorders>
+              <w:top w:val="single" w:sz="4" w:color="C8D9DC"/>
+              <w:left w:val="single" w:sz="4" w:color="C8D9DC"/>
+              <w:bottom w:val="single" w:sz="4" w:color="C8D9DC"/>
+              <w:right w:val="single" w:sz="4" w:color="C8D9DC"/>
+              <w:insideH w:val="single" w:sz="4" w:color="C8D9DC"/>
+              <w:insideV w:val="single" w:sz="4" w:color="C8D9DC"/>
+            </w:tcBorders>
+            <w:vAlign w:val="center"/>
+          </w:tcPr>
+          <w:p>
+            <w:r>
+              <w:rPr>
+                <w:color w:val="102B3E"/>
+                <w:sz w:val="17"/>
+              </w:rPr>
+              <w:t>1</w:t>
+            </w:r>
+          </w:p>
+        </w:tc>
+        <w:tc>
+          <w:tcPr>
+            <w:tcW w:type="dxa" w:w="3389"/>
+            <w:shd w:fill="FFFFFF"/>
+            <w:tcBorders>
+              <w:top w:val="single" w:sz="4" w:color="C8D9DC"/>
+              <w:left w:val="single" w:sz="4" w:color="C8D9DC"/>
+              <w:bottom w:val="single" w:sz="4" w:color="C8D9DC"/>
+              <w:right w:val="single" w:sz="4" w:color="C8D9DC"/>
+              <w:insideH w:val="single" w:sz="4" w:color="C8D9DC"/>
+              <w:insideV w:val="single" w:sz="4" w:color="C8D9DC"/>
+            </w:tcBorders>
+            <w:vAlign w:val="center"/>
+          </w:tcPr>
+          <w:p>
+            <w:r>
+              <w:rPr>
+                <w:color w:val="102B3E"/>
+                <w:sz w:val="17"/>
+              </w:rPr>
+              <w:t>Chat structures the pump brief; app selection</w:t>
+            </w:r>
+          </w:p>
+        </w:tc>
+        <w:tc>
+          <w:tcPr>
+            <w:tcW w:type="dxa" w:w="3389"/>
+            <w:shd w:fill="FFFFFF"/>
+            <w:tcBorders>
+              <w:top w:val="single" w:sz="4" w:color="C8D9DC"/>
+              <w:left w:val="single" w:sz="4" w:color="C8D9DC"/>
+              <w:bottom w:val="single" w:sz="4" w:color="C8D9DC"/>
+              <w:right w:val="single" w:sz="4" w:color="C8D9DC"/>
+              <w:insideH w:val="single" w:sz="4" w:color="C8D9DC"/>
+              <w:insideV w:val="single" w:sz="4" w:color="C8D9DC"/>
+            </w:tcBorders>
+            <w:vAlign w:val="center"/>
+          </w:tcPr>
+          <w:p>
+            <w:r>
+              <w:rPr>
+                <w:color w:val="102B3E"/>
+                <w:sz w:val="17"/>
+              </w:rPr>
+              <w:t>Facts, assumptions and evidence boundary</w:t>
+            </w:r>
+          </w:p>
+        </w:tc>
+      </w:tr>
+      <w:tr>
+        <w:tc>
+          <w:tcPr>
+            <w:tcW w:type="dxa" w:w="3389"/>
+            <w:shd w:fill="EAF3F4"/>
+            <w:tcBorders>
+              <w:top w:val="single" w:sz="4" w:color="C8D9DC"/>
+              <w:left w:val="single" w:sz="4" w:color="C8D9DC"/>
+              <w:bottom w:val="single" w:sz="4" w:color="C8D9DC"/>
+              <w:right w:val="single" w:sz="4" w:color="C8D9DC"/>
+              <w:insideH w:val="single" w:sz="4" w:color="C8D9DC"/>
+              <w:insideV w:val="single" w:sz="4" w:color="C8D9DC"/>
+            </w:tcBorders>
+            <w:vAlign w:val="center"/>
+          </w:tcPr>
+          <w:p>
+            <w:r>
+              <w:rPr>
+                <w:color w:val="102B3E"/>
+                <w:sz w:val="17"/>
+              </w:rPr>
+              <w:t>2</w:t>
+            </w:r>
+          </w:p>
+        </w:tc>
+        <w:tc>
+          <w:tcPr>
+            <w:tcW w:type="dxa" w:w="3389"/>
+            <w:shd w:fill="EAF3F4"/>
+            <w:tcBorders>
+              <w:top w:val="single" w:sz="4" w:color="C8D9DC"/>
+              <w:left w:val="single" w:sz="4" w:color="C8D9DC"/>
+              <w:bottom w:val="single" w:sz="4" w:color="C8D9DC"/>
+              <w:right w:val="single" w:sz="4" w:color="C8D9DC"/>
+              <w:insideH w:val="single" w:sz="4" w:color="C8D9DC"/>
+              <w:insideV w:val="single" w:sz="4" w:color="C8D9DC"/>
+            </w:tcBorders>
+            <w:vAlign w:val="center"/>
+          </w:tcPr>
+          <w:p>
+            <w:r>
+              <w:rPr>
+                <w:color w:val="102B3E"/>
+                <w:sz w:val="17"/>
+              </w:rPr>
+              <w:t>Word/PowerPoint document drafts using RISE/E-MAP</w:t>
+            </w:r>
+          </w:p>
+        </w:tc>
+        <w:tc>
+          <w:tcPr>
+            <w:tcW w:type="dxa" w:w="3389"/>
+            <w:shd w:fill="EAF3F4"/>
+            <w:tcBorders>
+              <w:top w:val="single" w:sz="4" w:color="C8D9DC"/>
+              <w:left w:val="single" w:sz="4" w:color="C8D9DC"/>
+              <w:bottom w:val="single" w:sz="4" w:color="C8D9DC"/>
+              <w:right w:val="single" w:sz="4" w:color="C8D9DC"/>
+              <w:insideH w:val="single" w:sz="4" w:color="C8D9DC"/>
+              <w:insideV w:val="single" w:sz="4" w:color="C8D9DC"/>
+            </w:tcBorders>
+            <w:vAlign w:val="center"/>
+          </w:tcPr>
+          <w:p>
+            <w:r>
+              <w:rPr>
+                <w:color w:val="102B3E"/>
+                <w:sz w:val="17"/>
+              </w:rPr>
+              <w:t>Requirements, criteria, units and approval</w:t>
+            </w:r>
+          </w:p>
+        </w:tc>
+      </w:tr>
+      <w:tr>
+        <w:tc>
+          <w:tcPr>
+            <w:tcW w:type="dxa" w:w="3389"/>
+            <w:shd w:fill="FFFFFF"/>
+            <w:tcBorders>
+              <w:top w:val="single" w:sz="4" w:color="C8D9DC"/>
+              <w:left w:val="single" w:sz="4" w:color="C8D9DC"/>
+              <w:bottom w:val="single" w:sz="4" w:color="C8D9DC"/>
+              <w:right w:val="single" w:sz="4" w:color="C8D9DC"/>
+              <w:insideH w:val="single" w:sz="4" w:color="C8D9DC"/>
+              <w:insideV w:val="single" w:sz="4" w:color="C8D9DC"/>
+            </w:tcBorders>
+            <w:vAlign w:val="center"/>
+          </w:tcPr>
+          <w:p>
+            <w:r>
+              <w:rPr>
+                <w:color w:val="102B3E"/>
+                <w:sz w:val="17"/>
+              </w:rPr>
+              <w:t>3</w:t>
+            </w:r>
+          </w:p>
+        </w:tc>
+        <w:tc>
+          <w:tcPr>
+            <w:tcW w:type="dxa" w:w="3389"/>
+            <w:shd w:fill="FFFFFF"/>
+            <w:tcBorders>
+              <w:top w:val="single" w:sz="4" w:color="C8D9DC"/>
+              <w:left w:val="single" w:sz="4" w:color="C8D9DC"/>
+              <w:bottom w:val="single" w:sz="4" w:color="C8D9DC"/>
+              <w:right w:val="single" w:sz="4" w:color="C8D9DC"/>
+              <w:insideH w:val="single" w:sz="4" w:color="C8D9DC"/>
+              <w:insideV w:val="single" w:sz="4" w:color="C8D9DC"/>
+            </w:tcBorders>
+            <w:vAlign w:val="center"/>
+          </w:tcPr>
+          <w:p>
+            <w:r>
+              <w:rPr>
+                <w:color w:val="102B3E"/>
+                <w:sz w:val="17"/>
+              </w:rPr>
+              <w:t>Excel calculations, tables and charts</w:t>
+            </w:r>
+          </w:p>
+        </w:tc>
+        <w:tc>
+          <w:tcPr>
+            <w:tcW w:type="dxa" w:w="3389"/>
+            <w:shd w:fill="FFFFFF"/>
+            <w:tcBorders>
+              <w:top w:val="single" w:sz="4" w:color="C8D9DC"/>
+              <w:left w:val="single" w:sz="4" w:color="C8D9DC"/>
+              <w:bottom w:val="single" w:sz="4" w:color="C8D9DC"/>
+              <w:right w:val="single" w:sz="4" w:color="C8D9DC"/>
+              <w:insideH w:val="single" w:sz="4" w:color="C8D9DC"/>
+              <w:insideV w:val="single" w:sz="4" w:color="C8D9DC"/>
+            </w:tcBorders>
+            <w:vAlign w:val="center"/>
+          </w:tcPr>
+          <w:p>
+            <w:r>
+              <w:rPr>
+                <w:color w:val="102B3E"/>
+                <w:sz w:val="17"/>
+              </w:rPr>
+              <w:t>RPN, rates, control limits and interpretation</w:t>
+            </w:r>
+          </w:p>
+        </w:tc>
+      </w:tr>
+      <w:tr>
+        <w:tc>
+          <w:tcPr>
+            <w:tcW w:type="dxa" w:w="3389"/>
+            <w:shd w:fill="EAF3F4"/>
+            <w:tcBorders>
+              <w:top w:val="single" w:sz="4" w:color="C8D9DC"/>
+              <w:left w:val="single" w:sz="4" w:color="C8D9DC"/>
+              <w:bottom w:val="single" w:sz="4" w:color="C8D9DC"/>
+              <w:right w:val="single" w:sz="4" w:color="C8D9DC"/>
+              <w:insideH w:val="single" w:sz="4" w:color="C8D9DC"/>
+              <w:insideV w:val="single" w:sz="4" w:color="C8D9DC"/>
+            </w:tcBorders>
+            <w:vAlign w:val="center"/>
+          </w:tcPr>
+          <w:p>
+            <w:r>
+              <w:rPr>
+                <w:color w:val="102B3E"/>
+                <w:sz w:val="17"/>
+              </w:rPr>
+              <w:t>4</w:t>
+            </w:r>
+          </w:p>
+        </w:tc>
+        <w:tc>
+          <w:tcPr>
+            <w:tcW w:type="dxa" w:w="3389"/>
+            <w:shd w:fill="EAF3F4"/>
+            <w:tcBorders>
+              <w:top w:val="single" w:sz="4" w:color="C8D9DC"/>
+              <w:left w:val="single" w:sz="4" w:color="C8D9DC"/>
+              <w:bottom w:val="single" w:sz="4" w:color="C8D9DC"/>
+              <w:right w:val="single" w:sz="4" w:color="C8D9DC"/>
+              <w:insideH w:val="single" w:sz="4" w:color="C8D9DC"/>
+              <w:insideV w:val="single" w:sz="4" w:color="C8D9DC"/>
+            </w:tcBorders>
+            <w:vAlign w:val="center"/>
+          </w:tcPr>
+          <w:p>
+            <w:r>
+              <w:rPr>
+                <w:color w:val="102B3E"/>
+                <w:sz w:val="17"/>
+              </w:rPr>
+              <w:t>FMEA Agent workflow; Researcher; Analyst</w:t>
+            </w:r>
+          </w:p>
+        </w:tc>
+        <w:tc>
+          <w:tcPr>
+            <w:tcW w:type="dxa" w:w="3389"/>
+            <w:shd w:fill="EAF3F4"/>
+            <w:tcBorders>
+              <w:top w:val="single" w:sz="4" w:color="C8D9DC"/>
+              <w:left w:val="single" w:sz="4" w:color="C8D9DC"/>
+              <w:bottom w:val="single" w:sz="4" w:color="C8D9DC"/>
+              <w:right w:val="single" w:sz="4" w:color="C8D9DC"/>
+              <w:insideH w:val="single" w:sz="4" w:color="C8D9DC"/>
+              <w:insideV w:val="single" w:sz="4" w:color="C8D9DC"/>
+            </w:tcBorders>
+            <w:vAlign w:val="center"/>
+          </w:tcPr>
+          <w:p>
+            <w:r>
+              <w:rPr>
+                <w:color w:val="102B3E"/>
+                <w:sz w:val="17"/>
+              </w:rPr>
+              <w:t>Negative tests, citations and four anchor values</w:t>
+            </w:r>
+          </w:p>
+        </w:tc>
+      </w:tr>
+      <w:tr>
+        <w:tc>
+          <w:tcPr>
+            <w:tcW w:type="dxa" w:w="3389"/>
+            <w:shd w:fill="FFFFFF"/>
+            <w:tcBorders>
+              <w:top w:val="single" w:sz="4" w:color="C8D9DC"/>
+              <w:left w:val="single" w:sz="4" w:color="C8D9DC"/>
+              <w:bottom w:val="single" w:sz="4" w:color="C8D9DC"/>
+              <w:right w:val="single" w:sz="4" w:color="C8D9DC"/>
+              <w:insideH w:val="single" w:sz="4" w:color="C8D9DC"/>
+              <w:insideV w:val="single" w:sz="4" w:color="C8D9DC"/>
+            </w:tcBorders>
+            <w:vAlign w:val="center"/>
+          </w:tcPr>
+          <w:p>
+            <w:r>
+              <w:rPr>
+                <w:color w:val="102B3E"/>
+                <w:sz w:val="17"/>
+              </w:rPr>
+              <w:t>5</w:t>
+            </w:r>
+          </w:p>
+        </w:tc>
+        <w:tc>
+          <w:tcPr>
+            <w:tcW w:type="dxa" w:w="3389"/>
+            <w:shd w:fill="FFFFFF"/>
+            <w:tcBorders>
+              <w:top w:val="single" w:sz="4" w:color="C8D9DC"/>
+              <w:left w:val="single" w:sz="4" w:color="C8D9DC"/>
+              <w:bottom w:val="single" w:sz="4" w:color="C8D9DC"/>
+              <w:right w:val="single" w:sz="4" w:color="C8D9DC"/>
+              <w:insideH w:val="single" w:sz="4" w:color="C8D9DC"/>
+              <w:insideV w:val="single" w:sz="4" w:color="C8D9DC"/>
+            </w:tcBorders>
+            <w:vAlign w:val="center"/>
+          </w:tcPr>
+          <w:p>
+            <w:r>
+              <w:rPr>
+                <w:color w:val="102B3E"/>
+                <w:sz w:val="17"/>
+              </w:rPr>
+              <w:t>SharePoint-grounded agent and cross-agent handoff</w:t>
+            </w:r>
+          </w:p>
+        </w:tc>
+        <w:tc>
+          <w:tcPr>
+            <w:tcW w:type="dxa" w:w="3389"/>
+            <w:shd w:fill="FFFFFF"/>
+            <w:tcBorders>
+              <w:top w:val="single" w:sz="4" w:color="C8D9DC"/>
+              <w:left w:val="single" w:sz="4" w:color="C8D9DC"/>
+              <w:bottom w:val="single" w:sz="4" w:color="C8D9DC"/>
+              <w:right w:val="single" w:sz="4" w:color="C8D9DC"/>
+              <w:insideH w:val="single" w:sz="4" w:color="C8D9DC"/>
+              <w:insideV w:val="single" w:sz="4" w:color="C8D9DC"/>
+            </w:tcBorders>
+            <w:vAlign w:val="center"/>
+          </w:tcPr>
+          <w:p>
+            <w:r>
+              <w:rPr>
+                <w:color w:val="102B3E"/>
+                <w:sz w:val="17"/>
+              </w:rPr>
+              <w:t>Source passage, revision, permissions and audience</w:t>
+            </w:r>
+          </w:p>
+        </w:tc>
+      </w:tr>
+      <w:tr>
+        <w:tc>
+          <w:tcPr>
+            <w:tcW w:type="dxa" w:w="3389"/>
+            <w:shd w:fill="EAF3F4"/>
+            <w:tcBorders>
+              <w:top w:val="single" w:sz="4" w:color="C8D9DC"/>
+              <w:left w:val="single" w:sz="4" w:color="C8D9DC"/>
+              <w:bottom w:val="single" w:sz="4" w:color="C8D9DC"/>
+              <w:right w:val="single" w:sz="4" w:color="C8D9DC"/>
+              <w:insideH w:val="single" w:sz="4" w:color="C8D9DC"/>
+              <w:insideV w:val="single" w:sz="4" w:color="C8D9DC"/>
+            </w:tcBorders>
+            <w:vAlign w:val="center"/>
+          </w:tcPr>
+          <w:p>
+            <w:r>
+              <w:rPr>
+                <w:color w:val="102B3E"/>
+                <w:sz w:val="17"/>
+              </w:rPr>
+              <w:t>6</w:t>
+            </w:r>
+          </w:p>
+        </w:tc>
+        <w:tc>
+          <w:tcPr>
+            <w:tcW w:type="dxa" w:w="3389"/>
+            <w:shd w:fill="EAF3F4"/>
+            <w:tcBorders>
+              <w:top w:val="single" w:sz="4" w:color="C8D9DC"/>
+              <w:left w:val="single" w:sz="4" w:color="C8D9DC"/>
+              <w:bottom w:val="single" w:sz="4" w:color="C8D9DC"/>
+              <w:right w:val="single" w:sz="4" w:color="C8D9DC"/>
+              <w:insideH w:val="single" w:sz="4" w:color="C8D9DC"/>
+              <w:insideV w:val="single" w:sz="4" w:color="C8D9DC"/>
+            </w:tcBorders>
+            <w:vAlign w:val="center"/>
+          </w:tcPr>
+          <w:p>
+            <w:r>
+              <w:rPr>
+                <w:color w:val="102B3E"/>
+                <w:sz w:val="17"/>
+              </w:rPr>
+              <w:t>Security evidence log and release decision</w:t>
+            </w:r>
+          </w:p>
+        </w:tc>
+        <w:tc>
+          <w:tcPr>
+            <w:tcW w:type="dxa" w:w="3389"/>
+            <w:shd w:fill="EAF3F4"/>
+            <w:tcBorders>
+              <w:top w:val="single" w:sz="4" w:color="C8D9DC"/>
+              <w:left w:val="single" w:sz="4" w:color="C8D9DC"/>
+              <w:bottom w:val="single" w:sz="4" w:color="C8D9DC"/>
+              <w:right w:val="single" w:sz="4" w:color="C8D9DC"/>
+              <w:insideH w:val="single" w:sz="4" w:color="C8D9DC"/>
+              <w:insideV w:val="single" w:sz="4" w:color="C8D9DC"/>
+            </w:tcBorders>
+            <w:vAlign w:val="center"/>
+          </w:tcPr>
+          <w:p>
+            <w:r>
+              <w:rPr>
+                <w:color w:val="102B3E"/>
+                <w:sz w:val="17"/>
+              </w:rPr>
+              <w:t>All seven controls and named sign-off</w:t>
+            </w:r>
+          </w:p>
+        </w:tc>
+      </w:tr>
+    </w:tbl>
     <w:p>
-      <w:pPr/>
+      <w:pPr>
+        <w:pStyle w:val="Heading1"/>
+      </w:pPr>
       <w:r>
-        <w:t>Repeat five actions in each exercise: open the small Starter workbook; select the named table; open Copilot in Excel; paste the supplied RISE prompt; inspect the output and independently verify one result. Open Worked-Reference.xlsx only after the attempt.</w:t>
+        <w:t>Assessment of learning</w:t>
+      </w:r>
+    </w:p>
+    <w:tbl>
+      <w:tblPr>
+        <w:tblW w:type="auto" w:w="0"/>
+        <w:jc w:val="center"/>
+        <w:tblLayout w:type="autofit"/>
+        <w:tblLook w:firstColumn="1" w:firstRow="1" w:lastColumn="0" w:lastRow="0" w:noHBand="0" w:noVBand="1" w:val="04A0"/>
+      </w:tblPr>
+      <w:tblGrid>
+        <w:gridCol w:w="5083"/>
+        <w:gridCol w:w="5083"/>
+      </w:tblGrid>
+      <w:tr>
+        <w:tc>
+          <w:tcPr>
+            <w:tcW w:type="dxa" w:w="5083"/>
+            <w:shd w:fill="078897"/>
+            <w:tcBorders>
+              <w:top w:val="single" w:sz="4" w:color="C8D9DC"/>
+              <w:left w:val="single" w:sz="4" w:color="C8D9DC"/>
+              <w:bottom w:val="single" w:sz="4" w:color="C8D9DC"/>
+              <w:right w:val="single" w:sz="4" w:color="C8D9DC"/>
+              <w:insideH w:val="single" w:sz="4" w:color="C8D9DC"/>
+              <w:insideV w:val="single" w:sz="4" w:color="C8D9DC"/>
+            </w:tcBorders>
+            <w:vAlign w:val="center"/>
+          </w:tcPr>
+          <w:p>
+            <w:r>
+              <w:rPr>
+                <w:b/>
+                <w:color w:val="FFFFFF"/>
+                <w:sz w:val="18"/>
+              </w:rPr>
+              <w:t>LO</w:t>
+            </w:r>
+          </w:p>
+        </w:tc>
+        <w:tc>
+          <w:tcPr>
+            <w:tcW w:type="dxa" w:w="5083"/>
+            <w:shd w:fill="078897"/>
+            <w:tcBorders>
+              <w:top w:val="single" w:sz="4" w:color="C8D9DC"/>
+              <w:left w:val="single" w:sz="4" w:color="C8D9DC"/>
+              <w:bottom w:val="single" w:sz="4" w:color="C8D9DC"/>
+              <w:right w:val="single" w:sz="4" w:color="C8D9DC"/>
+              <w:insideH w:val="single" w:sz="4" w:color="C8D9DC"/>
+              <w:insideV w:val="single" w:sz="4" w:color="C8D9DC"/>
+            </w:tcBorders>
+            <w:vAlign w:val="center"/>
+          </w:tcPr>
+          <w:p>
+            <w:r>
+              <w:rPr>
+                <w:b/>
+                <w:color w:val="FFFFFF"/>
+                <w:sz w:val="18"/>
+              </w:rPr>
+              <w:t>Formative evidence</w:t>
+            </w:r>
+          </w:p>
+        </w:tc>
+      </w:tr>
+      <w:tr>
+        <w:tc>
+          <w:tcPr>
+            <w:tcW w:type="dxa" w:w="5083"/>
+            <w:shd w:fill="FFFFFF"/>
+            <w:tcBorders>
+              <w:top w:val="single" w:sz="4" w:color="C8D9DC"/>
+              <w:left w:val="single" w:sz="4" w:color="C8D9DC"/>
+              <w:bottom w:val="single" w:sz="4" w:color="C8D9DC"/>
+              <w:right w:val="single" w:sz="4" w:color="C8D9DC"/>
+              <w:insideH w:val="single" w:sz="4" w:color="C8D9DC"/>
+              <w:insideV w:val="single" w:sz="4" w:color="C8D9DC"/>
+            </w:tcBorders>
+            <w:vAlign w:val="center"/>
+          </w:tcPr>
+          <w:p>
+            <w:r>
+              <w:rPr>
+                <w:color w:val="102B3E"/>
+                <w:sz w:val="17"/>
+              </w:rPr>
+              <w:t>LO1</w:t>
+            </w:r>
+          </w:p>
+        </w:tc>
+        <w:tc>
+          <w:tcPr>
+            <w:tcW w:type="dxa" w:w="5083"/>
+            <w:shd w:fill="FFFFFF"/>
+            <w:tcBorders>
+              <w:top w:val="single" w:sz="4" w:color="C8D9DC"/>
+              <w:left w:val="single" w:sz="4" w:color="C8D9DC"/>
+              <w:bottom w:val="single" w:sz="4" w:color="C8D9DC"/>
+              <w:right w:val="single" w:sz="4" w:color="C8D9DC"/>
+              <w:insideH w:val="single" w:sz="4" w:color="C8D9DC"/>
+              <w:insideV w:val="single" w:sz="4" w:color="C8D9DC"/>
+            </w:tcBorders>
+            <w:vAlign w:val="center"/>
+          </w:tcPr>
+          <w:p>
+            <w:r>
+              <w:rPr>
+                <w:color w:val="102B3E"/>
+                <w:sz w:val="17"/>
+              </w:rPr>
+              <w:t>Correctly explains method purpose, terms and output.</w:t>
+            </w:r>
+          </w:p>
+        </w:tc>
+      </w:tr>
+      <w:tr>
+        <w:tc>
+          <w:tcPr>
+            <w:tcW w:type="dxa" w:w="5083"/>
+            <w:shd w:fill="EAF3F4"/>
+            <w:tcBorders>
+              <w:top w:val="single" w:sz="4" w:color="C8D9DC"/>
+              <w:left w:val="single" w:sz="4" w:color="C8D9DC"/>
+              <w:bottom w:val="single" w:sz="4" w:color="C8D9DC"/>
+              <w:right w:val="single" w:sz="4" w:color="C8D9DC"/>
+              <w:insideH w:val="single" w:sz="4" w:color="C8D9DC"/>
+              <w:insideV w:val="single" w:sz="4" w:color="C8D9DC"/>
+            </w:tcBorders>
+            <w:vAlign w:val="center"/>
+          </w:tcPr>
+          <w:p>
+            <w:r>
+              <w:rPr>
+                <w:color w:val="102B3E"/>
+                <w:sz w:val="17"/>
+              </w:rPr>
+              <w:t>LO2</w:t>
+            </w:r>
+          </w:p>
+        </w:tc>
+        <w:tc>
+          <w:tcPr>
+            <w:tcW w:type="dxa" w:w="5083"/>
+            <w:shd w:fill="EAF3F4"/>
+            <w:tcBorders>
+              <w:top w:val="single" w:sz="4" w:color="C8D9DC"/>
+              <w:left w:val="single" w:sz="4" w:color="C8D9DC"/>
+              <w:bottom w:val="single" w:sz="4" w:color="C8D9DC"/>
+              <w:right w:val="single" w:sz="4" w:color="C8D9DC"/>
+              <w:insideH w:val="single" w:sz="4" w:color="C8D9DC"/>
+              <w:insideV w:val="single" w:sz="4" w:color="C8D9DC"/>
+            </w:tcBorders>
+            <w:vAlign w:val="center"/>
+          </w:tcPr>
+          <w:p>
+            <w:r>
+              <w:rPr>
+                <w:color w:val="102B3E"/>
+                <w:sz w:val="17"/>
+              </w:rPr>
+              <w:t>Produces checked FMEA, DMAIC and SPC outputs and critiques Word/PPT drafts.</w:t>
+            </w:r>
+          </w:p>
+        </w:tc>
+      </w:tr>
+      <w:tr>
+        <w:tc>
+          <w:tcPr>
+            <w:tcW w:type="dxa" w:w="5083"/>
+            <w:shd w:fill="FFFFFF"/>
+            <w:tcBorders>
+              <w:top w:val="single" w:sz="4" w:color="C8D9DC"/>
+              <w:left w:val="single" w:sz="4" w:color="C8D9DC"/>
+              <w:bottom w:val="single" w:sz="4" w:color="C8D9DC"/>
+              <w:right w:val="single" w:sz="4" w:color="C8D9DC"/>
+              <w:insideH w:val="single" w:sz="4" w:color="C8D9DC"/>
+              <w:insideV w:val="single" w:sz="4" w:color="C8D9DC"/>
+            </w:tcBorders>
+            <w:vAlign w:val="center"/>
+          </w:tcPr>
+          <w:p>
+            <w:r>
+              <w:rPr>
+                <w:color w:val="102B3E"/>
+                <w:sz w:val="17"/>
+              </w:rPr>
+              <w:t>LO3</w:t>
+            </w:r>
+          </w:p>
+        </w:tc>
+        <w:tc>
+          <w:tcPr>
+            <w:tcW w:type="dxa" w:w="5083"/>
+            <w:shd w:fill="FFFFFF"/>
+            <w:tcBorders>
+              <w:top w:val="single" w:sz="4" w:color="C8D9DC"/>
+              <w:left w:val="single" w:sz="4" w:color="C8D9DC"/>
+              <w:bottom w:val="single" w:sz="4" w:color="C8D9DC"/>
+              <w:right w:val="single" w:sz="4" w:color="C8D9DC"/>
+              <w:insideH w:val="single" w:sz="4" w:color="C8D9DC"/>
+              <w:insideV w:val="single" w:sz="4" w:color="C8D9DC"/>
+            </w:tcBorders>
+            <w:vAlign w:val="center"/>
+          </w:tcPr>
+          <w:p>
+            <w:r>
+              <w:rPr>
+                <w:color w:val="102B3E"/>
+                <w:sz w:val="17"/>
+              </w:rPr>
+              <w:t>Labels RISE/E-MAP content and improves one prompt after checking.</w:t>
+            </w:r>
+          </w:p>
+        </w:tc>
+      </w:tr>
+      <w:tr>
+        <w:tc>
+          <w:tcPr>
+            <w:tcW w:type="dxa" w:w="5083"/>
+            <w:shd w:fill="EAF3F4"/>
+            <w:tcBorders>
+              <w:top w:val="single" w:sz="4" w:color="C8D9DC"/>
+              <w:left w:val="single" w:sz="4" w:color="C8D9DC"/>
+              <w:bottom w:val="single" w:sz="4" w:color="C8D9DC"/>
+              <w:right w:val="single" w:sz="4" w:color="C8D9DC"/>
+              <w:insideH w:val="single" w:sz="4" w:color="C8D9DC"/>
+              <w:insideV w:val="single" w:sz="4" w:color="C8D9DC"/>
+            </w:tcBorders>
+            <w:vAlign w:val="center"/>
+          </w:tcPr>
+          <w:p>
+            <w:r>
+              <w:rPr>
+                <w:color w:val="102B3E"/>
+                <w:sz w:val="17"/>
+              </w:rPr>
+              <w:t>LO4</w:t>
+            </w:r>
+          </w:p>
+        </w:tc>
+        <w:tc>
+          <w:tcPr>
+            <w:tcW w:type="dxa" w:w="5083"/>
+            <w:shd w:fill="EAF3F4"/>
+            <w:tcBorders>
+              <w:top w:val="single" w:sz="4" w:color="C8D9DC"/>
+              <w:left w:val="single" w:sz="4" w:color="C8D9DC"/>
+              <w:bottom w:val="single" w:sz="4" w:color="C8D9DC"/>
+              <w:right w:val="single" w:sz="4" w:color="C8D9DC"/>
+              <w:insideH w:val="single" w:sz="4" w:color="C8D9DC"/>
+              <w:insideV w:val="single" w:sz="4" w:color="C8D9DC"/>
+            </w:tcBorders>
+            <w:vAlign w:val="center"/>
+          </w:tcPr>
+          <w:p>
+            <w:r>
+              <w:rPr>
+                <w:color w:val="102B3E"/>
+                <w:sz w:val="17"/>
+              </w:rPr>
+              <w:t>Agent passes complete-row and missing-data tests.</w:t>
+            </w:r>
+          </w:p>
+        </w:tc>
+      </w:tr>
+      <w:tr>
+        <w:tc>
+          <w:tcPr>
+            <w:tcW w:type="dxa" w:w="5083"/>
+            <w:shd w:fill="FFFFFF"/>
+            <w:tcBorders>
+              <w:top w:val="single" w:sz="4" w:color="C8D9DC"/>
+              <w:left w:val="single" w:sz="4" w:color="C8D9DC"/>
+              <w:bottom w:val="single" w:sz="4" w:color="C8D9DC"/>
+              <w:right w:val="single" w:sz="4" w:color="C8D9DC"/>
+              <w:insideH w:val="single" w:sz="4" w:color="C8D9DC"/>
+              <w:insideV w:val="single" w:sz="4" w:color="C8D9DC"/>
+            </w:tcBorders>
+            <w:vAlign w:val="center"/>
+          </w:tcPr>
+          <w:p>
+            <w:r>
+              <w:rPr>
+                <w:color w:val="102B3E"/>
+                <w:sz w:val="17"/>
+              </w:rPr>
+              <w:t>LO5</w:t>
+            </w:r>
+          </w:p>
+        </w:tc>
+        <w:tc>
+          <w:tcPr>
+            <w:tcW w:type="dxa" w:w="5083"/>
+            <w:shd w:fill="FFFFFF"/>
+            <w:tcBorders>
+              <w:top w:val="single" w:sz="4" w:color="C8D9DC"/>
+              <w:left w:val="single" w:sz="4" w:color="C8D9DC"/>
+              <w:bottom w:val="single" w:sz="4" w:color="C8D9DC"/>
+              <w:right w:val="single" w:sz="4" w:color="C8D9DC"/>
+              <w:insideH w:val="single" w:sz="4" w:color="C8D9DC"/>
+              <w:insideV w:val="single" w:sz="4" w:color="C8D9DC"/>
+            </w:tcBorders>
+            <w:vAlign w:val="center"/>
+          </w:tcPr>
+          <w:p>
+            <w:r>
+              <w:rPr>
+                <w:color w:val="102B3E"/>
+                <w:sz w:val="17"/>
+              </w:rPr>
+              <w:t>Researcher citation opens; Analyst calculations reproduce.</w:t>
+            </w:r>
+          </w:p>
+        </w:tc>
+      </w:tr>
+      <w:tr>
+        <w:tc>
+          <w:tcPr>
+            <w:tcW w:type="dxa" w:w="5083"/>
+            <w:shd w:fill="EAF3F4"/>
+            <w:tcBorders>
+              <w:top w:val="single" w:sz="4" w:color="C8D9DC"/>
+              <w:left w:val="single" w:sz="4" w:color="C8D9DC"/>
+              <w:bottom w:val="single" w:sz="4" w:color="C8D9DC"/>
+              <w:right w:val="single" w:sz="4" w:color="C8D9DC"/>
+              <w:insideH w:val="single" w:sz="4" w:color="C8D9DC"/>
+              <w:insideV w:val="single" w:sz="4" w:color="C8D9DC"/>
+            </w:tcBorders>
+            <w:vAlign w:val="center"/>
+          </w:tcPr>
+          <w:p>
+            <w:r>
+              <w:rPr>
+                <w:color w:val="102B3E"/>
+                <w:sz w:val="17"/>
+              </w:rPr>
+              <w:t>LO6</w:t>
+            </w:r>
+          </w:p>
+        </w:tc>
+        <w:tc>
+          <w:tcPr>
+            <w:tcW w:type="dxa" w:w="5083"/>
+            <w:shd w:fill="EAF3F4"/>
+            <w:tcBorders>
+              <w:top w:val="single" w:sz="4" w:color="C8D9DC"/>
+              <w:left w:val="single" w:sz="4" w:color="C8D9DC"/>
+              <w:bottom w:val="single" w:sz="4" w:color="C8D9DC"/>
+              <w:right w:val="single" w:sz="4" w:color="C8D9DC"/>
+              <w:insideH w:val="single" w:sz="4" w:color="C8D9DC"/>
+              <w:insideV w:val="single" w:sz="4" w:color="C8D9DC"/>
+            </w:tcBorders>
+            <w:vAlign w:val="center"/>
+          </w:tcPr>
+          <w:p>
+            <w:r>
+              <w:rPr>
+                <w:color w:val="102B3E"/>
+                <w:sz w:val="17"/>
+              </w:rPr>
+              <w:t>Agent gives cited supported answer and preserves missing evidence.</w:t>
+            </w:r>
+          </w:p>
+        </w:tc>
+      </w:tr>
+      <w:tr>
+        <w:tc>
+          <w:tcPr>
+            <w:tcW w:type="dxa" w:w="5083"/>
+            <w:shd w:fill="FFFFFF"/>
+            <w:tcBorders>
+              <w:top w:val="single" w:sz="4" w:color="C8D9DC"/>
+              <w:left w:val="single" w:sz="4" w:color="C8D9DC"/>
+              <w:bottom w:val="single" w:sz="4" w:color="C8D9DC"/>
+              <w:right w:val="single" w:sz="4" w:color="C8D9DC"/>
+              <w:insideH w:val="single" w:sz="4" w:color="C8D9DC"/>
+              <w:insideV w:val="single" w:sz="4" w:color="C8D9DC"/>
+            </w:tcBorders>
+            <w:vAlign w:val="center"/>
+          </w:tcPr>
+          <w:p>
+            <w:r>
+              <w:rPr>
+                <w:color w:val="102B3E"/>
+                <w:sz w:val="17"/>
+              </w:rPr>
+              <w:t>LO7</w:t>
+            </w:r>
+          </w:p>
+        </w:tc>
+        <w:tc>
+          <w:tcPr>
+            <w:tcW w:type="dxa" w:w="5083"/>
+            <w:shd w:fill="FFFFFF"/>
+            <w:tcBorders>
+              <w:top w:val="single" w:sz="4" w:color="C8D9DC"/>
+              <w:left w:val="single" w:sz="4" w:color="C8D9DC"/>
+              <w:bottom w:val="single" w:sz="4" w:color="C8D9DC"/>
+              <w:right w:val="single" w:sz="4" w:color="C8D9DC"/>
+              <w:insideH w:val="single" w:sz="4" w:color="C8D9DC"/>
+              <w:insideV w:val="single" w:sz="4" w:color="C8D9DC"/>
+            </w:tcBorders>
+            <w:vAlign w:val="center"/>
+          </w:tcPr>
+          <w:p>
+            <w:r>
+              <w:rPr>
+                <w:color w:val="102B3E"/>
+                <w:sz w:val="17"/>
+              </w:rPr>
+              <w:t>Seven completed evidence rows and approve/revise/reject decision.</w:t>
+            </w:r>
+          </w:p>
+        </w:tc>
+      </w:tr>
+    </w:tbl>
+    <w:p>
+      <w:r>
+        <w:br w:type="page"/>
       </w:r>
     </w:p>
     <w:p>
       <w:pPr>
-        <w:pStyle w:val="Heading2"/>
+        <w:pStyle w:val="Heading1"/>
       </w:pPr>
       <w:r>
-        <w:t>Lab 1 - FMEA (20 minutes)</w:t>
-      </w:r>
-    </w:p>
-    <w:p>
-      <w:pPr/>
-      <w:r>
-        <w:t>Source: Labs/Lab-01-FMEA/Starter.xlsx · named table FMEAInput.</w:t>
-      </w:r>
-    </w:p>
-    <w:p>
-      <w:pPr/>
-      <w:r>
-        <w:t>Copilot prompt: Act as an FMEA facilitator. Use only FMEAInput and preserve every row and supplied rating. Calculate RPN = Severity × Occurrence × Detection, rank the rows, and flag Severity 9 or higher. Add one evidence request and action per row. Show the formula. Do not invent incidents, change ratings or approve the design.</w:t>
-      </w:r>
-    </w:p>
-    <w:p>
-      <w:pPr/>
-      <w:r>
-        <w:t>Independent check: Verify FM01: 7 × 5 × 4 = 140; confirm FM04 is flagged because Severity = 9.</w:t>
+        <w:t>Resources</w:t>
       </w:r>
     </w:p>
     <w:p>
       <w:pPr>
-        <w:pStyle w:val="Heading2"/>
+        <w:pStyle w:val="ListBullet"/>
+        <w:spacing w:after="40"/>
       </w:pPr>
       <w:r>
-        <w:t>Lab 2 - DMAIC (20 minutes)</w:t>
-      </w:r>
-    </w:p>
-    <w:p>
-      <w:pPr/>
-      <w:r>
-        <w:t>Source: Labs/Lab-02-DMAIC/Starter.xlsx · named table WeeklyData.</w:t>
-      </w:r>
-    </w:p>
-    <w:p>
-      <w:pPr/>
-      <w:r>
-        <w:t>Copilot prompt: Act as a Six Sigma project assistant. Use only WeeklyData. Calculate Baseline and Pilot deviation rates. Create a five-row Define, Measure, Analyse, Improve, Control summary. Separate facts from hypotheses, show formulas, and state that the short pilot does not prove cause.</w:t>
-      </w:r>
-    </w:p>
-    <w:p>
-      <w:pPr/>
-      <w:r>
-        <w:t>Independent check: Verify Baseline = 36/400 = 9.0% and Pilot = 7/200 = 3.5%; do not claim causation.</w:t>
+        <w:t>PPT/PDF: 186 slides; slides 1–162 support the timed route, 163–186 are optional quick references.</w:t>
       </w:r>
     </w:p>
     <w:p>
       <w:pPr>
-        <w:pStyle w:val="Heading2"/>
+        <w:pStyle w:val="ListBullet"/>
+        <w:spacing w:after="40"/>
       </w:pPr>
       <w:r>
-        <w:t>Lab 3 - SPC (25 minutes)</w:t>
-      </w:r>
-    </w:p>
-    <w:p>
-      <w:pPr/>
-      <w:r>
-        <w:t>Source: Labs/Lab-03-SPC/Starter.xlsx · named table PumpReadings.</w:t>
-      </w:r>
-    </w:p>
-    <w:p>
-      <w:pPr/>
-      <w:r>
-        <w:t>Copilot prompt: Act as an engineering data assistant. Use only PumpReadings. From the eight Baseline rows, calculate the mean, sample standard deviation, UCL and LCL. Flag T09–T12, create a line chart with the limits, and give a three-sentence interpretation. Show formulas. Do not claim a root cause or that the pump is safe.</w:t>
-      </w:r>
-    </w:p>
-    <w:p>
-      <w:pPr/>
-      <w:r>
-        <w:t>Independent check: Verify T10 = 59.4 L/h against the calculated LCL; interpret a signal as a reason to investigate.</w:t>
+        <w:t>Learner Guide: detailed concepts, procedures, prompts, checks and Microsoft links.</w:t>
       </w:r>
     </w:p>
     <w:p>
       <w:pPr>
-        <w:pStyle w:val="Heading2"/>
+        <w:pStyle w:val="ListBullet"/>
+        <w:spacing w:after="40"/>
       </w:pPr>
       <w:r>
-        <w:t>Microsoft 365 Copilot links</w:t>
+        <w:t>Facilitator Guide: timing, teaching points, expected outputs, misconceptions and fallbacks.</w:t>
       </w:r>
     </w:p>
     <w:p>
-      <w:pPr/>
+      <w:pPr>
+        <w:pStyle w:val="ListBullet"/>
+        <w:spacing w:after="40"/>
+      </w:pPr>
       <w:r>
-        <w:t>Microsoft 365 Copilot: https://m365.cloud.microsoft/chat</w:t>
+        <w:t>Sixteen Lesson Plan activity folders: each has a PDF, prompt, synthetic mock data and acceptance checks; Labs 3.1 and 3.2 also contain Excel workbooks.</w:t>
       </w:r>
     </w:p>
     <w:p>
-      <w:pPr/>
+      <w:pPr>
+        <w:pStyle w:val="ListBullet"/>
+        <w:spacing w:after="40"/>
+      </w:pPr>
       <w:r>
-        <w:t>Get started with Copilot in Excel: https://support.microsoft.com/en-us/office/get-started-with-copilot-in-excel</w:t>
+        <w:t>Trainer demonstration pack: agent, reasoning-agent, SharePoint and security resources.</w:t>
       </w:r>
     </w:p>
     <w:p>
-      <w:pPr/>
+      <w:pPr>
+        <w:pStyle w:val="Heading1"/>
+      </w:pPr>
       <w:r>
-        <w:t>How Copilot Chat works in Microsoft 365 apps: https://support.microsoft.com/en-us/microsoft-365-copilot/how-copilot-chat-works-in-microsoft-365-apps</w:t>
+        <w:t>Quality and contingency rules</w:t>
+      </w:r>
+    </w:p>
+    <w:p>
+      <w:pPr>
+        <w:pStyle w:val="ListBullet"/>
+        <w:spacing w:after="40"/>
+      </w:pPr>
+      <w:r>
+        <w:t>Module divider slides are full-page separators and contain no learning-content cards.</w:t>
+      </w:r>
+    </w:p>
+    <w:p>
+      <w:pPr>
+        <w:pStyle w:val="ListBullet"/>
+        <w:spacing w:after="40"/>
+      </w:pPr>
+      <w:r>
+        <w:t>Use visuals to explain mechanisms; use the Learner Guide for click-by-click procedures.</w:t>
+      </w:r>
+    </w:p>
+    <w:p>
+      <w:pPr>
+        <w:pStyle w:val="ListBullet"/>
+        <w:spacing w:after="40"/>
+      </w:pPr>
+      <w:r>
+        <w:t>Keep all activities inside their published module time boxes; use reference slides selectively.</w:t>
+      </w:r>
+    </w:p>
+    <w:p>
+      <w:pPr>
+        <w:pStyle w:val="ListBullet"/>
+        <w:spacing w:after="40"/>
+      </w:pPr>
+      <w:r>
+        <w:t>If live Copilot access fails, use the worked reference and complete the same independent check.</w:t>
+      </w:r>
+    </w:p>
+    <w:p>
+      <w:pPr>
+        <w:pStyle w:val="ListBullet"/>
+        <w:spacing w:after="40"/>
+      </w:pPr>
+      <w:r>
+        <w:t>All case data are synthetic. IES is the only provider branding.</w:t>
       </w:r>
     </w:p>
     <w:sectPr>
       <w:headerReference w:type="default" r:id="rId9"/>
       <w:footerReference w:type="default" r:id="rId10"/>
-      <w:pgSz w:w="11909" w:h="16834"/>
-      <w:pgMar w:top="936" w:right="1080" w:bottom="936" w:left="1080" w:header="720" w:footer="720" w:gutter="0"/>
+      <w:pgSz w:w="12240" w:h="15840"/>
+      <w:pgMar w:top="936" w:right="1037" w:bottom="893" w:left="1037" w:header="720" w:footer="720" w:gutter="0"/>
       <w:cols w:space="720"/>
       <w:docGrid w:linePitch="360"/>
     </w:sectPr>
@@ -1171,11 +3341,15 @@
   <w:p>
     <w:pPr>
       <w:pStyle w:val="Footer"/>
+      <w:jc w:val="left"/>
     </w:pPr>
     <w:r>
-      <w:t xml:space="preserve">IES  |  Training use  |  </w:t>
+      <w:rPr>
+        <w:color w:val="536A78"/>
+        <w:sz w:val="16"/>
+      </w:rPr>
+      <w:t>IES  |  Training use</w:t>
     </w:r>
-    <w:fldSimple w:instr="PAGE"/>
   </w:p>
 </w:ftr>
 </file>
@@ -1183,9 +3357,16 @@
 <file path=word/header1.xml><?xml version="1.0" encoding="utf-8"?>
 <w:hdr xmlns:m="http://schemas.openxmlformats.org/officeDocument/2006/math" xmlns:mc="http://schemas.openxmlformats.org/markup-compatibility/2006" xmlns:mo="http://schemas.microsoft.com/office/mac/office/2008/main" xmlns:mv="urn:schemas-microsoft-com:mac:vml" xmlns:o="urn:schemas-microsoft-com:office:office" xmlns:r="http://schemas.openxmlformats.org/officeDocument/2006/relationships" xmlns:v="urn:schemas-microsoft-com:vml" xmlns:w10="urn:schemas-microsoft-com:office:word" xmlns:w14="http://schemas.microsoft.com/office/word/2010/wordml" xmlns:w="http://schemas.openxmlformats.org/wordprocessingml/2006/main" xmlns:wne="http://schemas.microsoft.com/office/word/2006/wordml" xmlns:wp14="http://schemas.microsoft.com/office/word/2010/wordprocessingDrawing" xmlns:wp="http://schemas.openxmlformats.org/drawingml/2006/wordprocessingDrawing" xmlns:wpc="http://schemas.microsoft.com/office/word/2010/wordprocessingCanvas" xmlns:wpg="http://schemas.microsoft.com/office/word/2010/wordprocessingGroup" xmlns:wpi="http://schemas.microsoft.com/office/word/2010/wordprocessingInk" xmlns:wps="http://schemas.microsoft.com/office/word/2010/wordprocessingShape" mc:Ignorable="w14 wp14">
   <w:p>
-    <w:pPr/>
+    <w:pPr>
+      <w:pStyle w:val="Header"/>
+      <w:jc w:val="right"/>
+    </w:pPr>
     <w:r>
-      <w:t>IES | GenAI for Engineers</w:t>
+      <w:rPr>
+        <w:color w:val="078897"/>
+        <w:sz w:val="16"/>
+      </w:rPr>
+      <w:t>IES  |  GENAI FOR ENGINEERS</w:t>
     </w:r>
   </w:p>
 </w:hdr>
@@ -1554,13 +3735,10 @@
     <w:name w:val="Normal"/>
     <w:qFormat/>
     <w:rsid w:val="00FC693F"/>
-    <w:pPr>
-      <w:spacing w:after="140" w:line="259" w:lineRule="auto"/>
-    </w:pPr>
     <w:rPr>
-      <w:rFonts w:ascii="Arial" w:hAnsi="Arial"/>
-      <w:color w:val="000000"/>
-      <w:sz w:val="21"/>
+      <w:rFonts w:ascii="Aptos" w:hAnsi="Aptos"/>
+      <w:color w:val="102B3E"/>
+      <w:sz w:val="20"/>
     </w:rPr>
   </w:style>
   <w:style w:type="paragraph" w:styleId="Header">
@@ -1622,11 +3800,11 @@
       <w:outlineLvl w:val="0"/>
     </w:pPr>
     <w:rPr>
-      <w:rFonts w:asciiTheme="majorHAnsi" w:eastAsiaTheme="majorEastAsia" w:hAnsiTheme="majorHAnsi" w:cstheme="majorBidi" w:ascii="Arial" w:hAnsi="Arial"/>
+      <w:rFonts w:asciiTheme="majorHAnsi" w:eastAsiaTheme="majorEastAsia" w:hAnsiTheme="majorHAnsi" w:cstheme="majorBidi" w:ascii="Aptos Display" w:hAnsi="Aptos Display"/>
       <w:b/>
       <w:bCs/>
-      <w:color w:val="000000"/>
-      <w:sz w:val="36"/>
+      <w:color w:val="102B3E"/>
+      <w:sz w:val="44"/>
       <w:szCs w:val="28"/>
     </w:rPr>
   </w:style>
@@ -1646,11 +3824,11 @@
       <w:outlineLvl w:val="1"/>
     </w:pPr>
     <w:rPr>
-      <w:rFonts w:asciiTheme="majorHAnsi" w:eastAsiaTheme="majorEastAsia" w:hAnsiTheme="majorHAnsi" w:cstheme="majorBidi" w:ascii="Arial" w:hAnsi="Arial"/>
+      <w:rFonts w:asciiTheme="majorHAnsi" w:eastAsiaTheme="majorEastAsia" w:hAnsiTheme="majorHAnsi" w:cstheme="majorBidi" w:ascii="Aptos" w:hAnsi="Aptos"/>
       <w:b/>
       <w:bCs/>
-      <w:color w:val="000000"/>
-      <w:sz w:val="26"/>
+      <w:color w:val="078897"/>
+      <w:sz w:val="32"/>
       <w:szCs w:val="26"/>
     </w:rPr>
   </w:style>
@@ -1670,10 +3848,11 @@
       <w:outlineLvl w:val="2"/>
     </w:pPr>
     <w:rPr>
-      <w:rFonts w:asciiTheme="majorHAnsi" w:eastAsiaTheme="majorEastAsia" w:hAnsiTheme="majorHAnsi" w:cstheme="majorBidi" w:ascii="Arial" w:hAnsi="Arial"/>
+      <w:rFonts w:asciiTheme="majorHAnsi" w:eastAsiaTheme="majorEastAsia" w:hAnsiTheme="majorHAnsi" w:cstheme="majorBidi" w:ascii="Aptos" w:hAnsi="Aptos"/>
       <w:b/>
       <w:bCs/>
-      <w:color w:val="000000"/>
+      <w:color w:val="102B3E"/>
+      <w:sz w:val="24"/>
     </w:rPr>
   </w:style>
   <w:style w:type="paragraph" w:styleId="Heading4">
@@ -1904,15 +4083,19 @@
     <w:qFormat/>
     <w:rsid w:val="00FC693F"/>
     <w:pPr>
+      <w:pBdr>
+        <w:bottom w:val="single" w:sz="8" w:space="4" w:color="4F81BD" w:themeColor="accent1"/>
+      </w:pBdr>
       <w:spacing w:after="300" w:line="240" w:lineRule="auto"/>
       <w:contextualSpacing/>
     </w:pPr>
     <w:rPr>
-      <w:rFonts w:asciiTheme="majorHAnsi" w:eastAsiaTheme="majorEastAsia" w:hAnsiTheme="majorHAnsi" w:cstheme="majorBidi" w:ascii="Arial" w:hAnsi="Arial"/>
-      <w:color w:val="000000"/>
+      <w:rFonts w:asciiTheme="majorHAnsi" w:eastAsiaTheme="majorEastAsia" w:hAnsiTheme="majorHAnsi" w:cstheme="majorBidi" w:ascii="Aptos Display" w:hAnsi="Aptos Display"/>
+      <w:b/>
+      <w:color w:val="102B3E"/>
       <w:spacing w:val="5"/>
       <w:kern w:val="28"/>
-      <w:sz w:val="54"/>
+      <w:sz w:val="64"/>
       <w:szCs w:val="52"/>
     </w:rPr>
   </w:style>
@@ -1945,12 +4128,13 @@
       </w:numPr>
     </w:pPr>
     <w:rPr>
-      <w:rFonts w:asciiTheme="majorHAnsi" w:eastAsiaTheme="majorEastAsia" w:hAnsiTheme="majorHAnsi" w:cstheme="majorBidi" w:ascii="Arial" w:hAnsi="Arial"/>
+      <w:rFonts w:asciiTheme="majorHAnsi" w:eastAsiaTheme="majorEastAsia" w:hAnsiTheme="majorHAnsi" w:cstheme="majorBidi" w:ascii="Aptos" w:hAnsi="Aptos"/>
+      <w:b w:val="0"/>
       <w:i/>
       <w:iCs/>
-      <w:color w:val="000000"/>
+      <w:color w:val="536A78"/>
       <w:spacing w:val="15"/>
-      <w:sz w:val="24"/>
+      <w:sz w:val="28"/>
       <w:szCs w:val="24"/>
     </w:rPr>
   </w:style>
@@ -2388,6 +4572,9 @@
     <w:qFormat/>
     <w:rsid w:val="00FC693F"/>
     <w:pPr>
+      <w:pBdr>
+        <w:bottom w:val="single" w:sz="4" w:space="4" w:color="4F81BD" w:themeColor="accent1"/>
+      </w:pBdr>
       <w:spacing w:before="200" w:after="280"/>
       <w:ind w:left="936" w:right="936"/>
     </w:pPr>

</xml_diff>